<commit_message>
docs: drop DMRV-based initiative from WB state proposal
DMRV is positioned for the central BEE carbon-market onboarding and
registry flow, not as a state-department product. Remove the Sabuj
Shilpa initiative and its sources, rework the portfolio summary and
starting points around five initiatives, and replace the named DMRV
product on the goals slide with a general product/platform goal plus
an industry IoT data-logging services line.

Co-Authored-By: Claude Opus 5.5 <noreply@anthropic.com>
Claude-Session: https://claude.ai/code/session_01KWMWvQ91DXYjjkruj1UFSM
</commit_message>
<xml_diff>
--- a/docs/wb-ice-proposal-2026/WB_ICE_Initiatives.docx
+++ b/docs/wb-ice-proposal-2026/WB_ICE_Initiatives.docx
@@ -83,7 +83,7 @@
                 <w:sz w:val="28"/>
                 <w:szCs w:val="28"/>
               </w:rPr>
-              <w:t xml:space="preserve">Six technology initiatives to speed up investment, jobs and ease of doing business in West Bengal</w:t>
+              <w:t xml:space="preserve">Five technology initiatives to speed up investment, jobs and ease of doing business in West Bengal</w:t>
             </w:r>
           </w:p>
           <w:p>
@@ -175,7 +175,7 @@
           <w:sz w:val="20"/>
           <w:szCs w:val="20"/>
         </w:rPr>
-        <w:t xml:space="preserve">THE SIX INITIATIVES</w:t>
+        <w:t xml:space="preserve">THE FIVE INITIATIVES</w:t>
       </w:r>
     </w:p>
     <w:tbl>
@@ -670,101 +670,6 @@
           </w:p>
         </w:tc>
       </w:tr>
-      <w:tr>
-        <w:tc>
-          <w:tcPr>
-            <w:tcW w:type="dxa" w:w="900"/>
-            <w:tcBorders>
-              <w:top w:val="none" w:color="FFFFFF" w:sz="0"/>
-              <w:left w:val="none" w:color="FFFFFF" w:sz="0"/>
-              <w:bottom w:val="single" w:color="CBD5E1" w:sz="4"/>
-              <w:right w:val="none" w:color="FFFFFF" w:sz="0"/>
-            </w:tcBorders>
-            <w:tcMar>
-              <w:top w:type="dxa" w:w="70"/>
-              <w:left w:type="dxa" w:w="110"/>
-              <w:bottom w:type="dxa" w:w="70"/>
-              <w:right w:type="dxa" w:w="110"/>
-            </w:tcMar>
-            <w:vAlign w:val="center"/>
-          </w:tcPr>
-          <w:p>
-            <w:pPr>
-              <w:spacing w:after="0" w:before="0" w:line="252"/>
-            </w:pPr>
-            <w:r>
-              <w:rPr>
-                <w:rFonts w:ascii="Arial" w:cs="Arial" w:eastAsia="Arial" w:hAnsi="Arial"/>
-                <w:b/>
-                <w:bCs/>
-                <w:color w:val="B45309"/>
-                <w:sz w:val="30"/>
-                <w:szCs w:val="30"/>
-              </w:rPr>
-              <w:t xml:space="preserve">06</w:t>
-            </w:r>
-          </w:p>
-        </w:tc>
-        <w:tc>
-          <w:tcPr>
-            <w:tcW w:type="dxa" w:w="9418"/>
-            <w:tcBorders>
-              <w:top w:val="none" w:color="FFFFFF" w:sz="0"/>
-              <w:left w:val="none" w:color="FFFFFF" w:sz="0"/>
-              <w:bottom w:val="single" w:color="CBD5E1" w:sz="4"/>
-              <w:right w:val="none" w:color="FFFFFF" w:sz="0"/>
-            </w:tcBorders>
-            <w:tcMar>
-              <w:top w:type="dxa" w:w="70"/>
-              <w:left w:type="dxa" w:w="110"/>
-              <w:bottom w:type="dxa" w:w="70"/>
-              <w:right w:type="dxa" w:w="110"/>
-            </w:tcMar>
-            <w:vAlign w:val="top"/>
-          </w:tcPr>
-          <w:p>
-            <w:pPr>
-              <w:spacing w:after="20" w:before="0" w:line="252"/>
-            </w:pPr>
-            <w:r>
-              <w:rPr>
-                <w:rFonts w:ascii="Arial" w:cs="Arial" w:eastAsia="Arial" w:hAnsi="Arial"/>
-                <w:b/>
-                <w:bCs/>
-                <w:color w:val="1F3A5F"/>
-                <w:sz w:val="23"/>
-                <w:szCs w:val="23"/>
-              </w:rPr>
-              <w:t xml:space="preserve">Sabuj Shilpa</w:t>
-            </w:r>
-            <w:r>
-              <w:rPr>
-                <w:rFonts w:ascii="Arial" w:cs="Arial" w:eastAsia="Arial" w:hAnsi="Arial"/>
-                <w:color w:val="5B6472"/>
-                <w:sz w:val="19"/>
-                <w:szCs w:val="19"/>
-              </w:rPr>
-              <w:t xml:space="preserve">  ·  Green Industry DMRV &amp; Carbon-Readiness Platform</w:t>
-            </w:r>
-          </w:p>
-          <w:p>
-            <w:pPr>
-              <w:spacing w:after="0" w:before="0" w:line="252"/>
-            </w:pPr>
-            <w:r>
-              <w:rPr>
-                <w:rFonts w:ascii="Arial" w:cs="Arial" w:eastAsia="Arial" w:hAnsi="Arial"/>
-                <w:i/>
-                <w:iCs/>
-                <w:color w:val="1F2937"/>
-                <w:sz w:val="18"/>
-                <w:szCs w:val="18"/>
-              </w:rPr>
-              <w:t xml:space="preserve">Keep Bengal's industry compliant and export-ready, and let it earn from going green.</w:t>
-            </w:r>
-          </w:p>
-        </w:tc>
-      </w:tr>
     </w:tbl>
     <w:p>
       <w:pPr>
@@ -828,7 +733,7 @@
           <w:sz w:val="19"/>
           <w:szCs w:val="19"/>
         </w:rPr>
-        <w:t xml:space="preserve">West Bengal's new government has made industrial revival its first economic priority. Its plans include a jobs-linked incentive pool of ₹5,000 crore, a new land policy, an overhaul of Silpa Sathi, revival of closed-factory land, and a ₹1,000 crore programme to rejuvenate legacy clusters. Each of these commitments now needs a digital backbone that makes it fast, verifiable and visible to investors. The six initiatives below were chosen because they either do not exist yet or exist only as static portals, and because each one directly supports a commitment the government has already announced.</w:t>
+        <w:t xml:space="preserve">West Bengal's new government has made industrial revival its first economic priority. Its plans include a jobs-linked incentive pool of ₹5,000 crore, a new land policy, an overhaul of Silpa Sathi, revival of closed-factory land, and a ₹1,000 crore programme to rejuvenate legacy clusters. Each of these commitments now needs a digital backbone that makes it fast, verifiable and visible to investors. The five initiatives below were chosen because they either do not exist yet or exist only as static portals, and because each one directly supports a commitment the government has already announced.</w:t>
       </w:r>
     </w:p>
     <w:tbl>
@@ -2170,49 +2075,15 @@
       <w:tr>
         <w:tc>
           <w:tcPr>
-            <w:tcW w:type="dxa" w:w="450"/>
-            <w:tcBorders>
-              <w:top w:val="single" w:color="CBD5E1" w:sz="4"/>
-              <w:left w:val="single" w:color="CBD5E1" w:sz="4"/>
-              <w:bottom w:val="single" w:color="CBD5E1" w:sz="4"/>
-              <w:right w:val="single" w:color="CBD5E1" w:sz="4"/>
-            </w:tcBorders>
-            <w:shd w:fill="FFFFFF" w:color="auto" w:val="clear"/>
-            <w:tcMar>
-              <w:top w:type="dxa" w:w="70"/>
-              <w:left w:type="dxa" w:w="110"/>
-              <w:bottom w:type="dxa" w:w="70"/>
-              <w:right w:type="dxa" w:w="110"/>
-            </w:tcMar>
-            <w:vAlign w:val="top"/>
-          </w:tcPr>
-          <w:p>
-            <w:pPr>
-              <w:spacing w:after="0" w:before="0" w:line="252"/>
-            </w:pPr>
-            <w:r>
-              <w:rPr>
-                <w:rFonts w:ascii="Arial" w:cs="Arial" w:eastAsia="Arial" w:hAnsi="Arial"/>
-                <w:b/>
-                <w:bCs/>
-                <w:color w:val="B45309"/>
-                <w:sz w:val="18"/>
-                <w:szCs w:val="18"/>
-              </w:rPr>
-              <w:t xml:space="preserve">06</w:t>
-            </w:r>
-          </w:p>
-        </w:tc>
-        <w:tc>
-          <w:tcPr>
-            <w:tcW w:type="dxa" w:w="1850"/>
-            <w:tcBorders>
-              <w:top w:val="single" w:color="CBD5E1" w:sz="4"/>
-              <w:left w:val="single" w:color="CBD5E1" w:sz="4"/>
-              <w:bottom w:val="single" w:color="CBD5E1" w:sz="4"/>
-              <w:right w:val="single" w:color="CBD5E1" w:sz="4"/>
-            </w:tcBorders>
-            <w:shd w:fill="FFFFFF" w:color="auto" w:val="clear"/>
+            <w:tcW w:type="dxa" w:w="7350"/>
+            <w:gridSpan w:val="4"/>
+            <w:tcBorders>
+              <w:top w:val="single" w:color="CBD5E1" w:sz="4"/>
+              <w:left w:val="single" w:color="CBD5E1" w:sz="4"/>
+              <w:bottom w:val="single" w:color="CBD5E1" w:sz="4"/>
+              <w:right w:val="single" w:color="CBD5E1" w:sz="4"/>
+            </w:tcBorders>
+            <w:shd w:fill="EAF0F7" w:color="auto" w:val="clear"/>
             <w:tcMar>
               <w:top w:type="dxa" w:w="70"/>
               <w:left w:type="dxa" w:w="110"/>
@@ -2234,34 +2105,20 @@
                 <w:sz w:val="18"/>
                 <w:szCs w:val="18"/>
               </w:rPr>
-              <w:t xml:space="preserve">Sabuj Shilpa</w:t>
-            </w:r>
-          </w:p>
-          <w:p>
-            <w:pPr>
-              <w:spacing w:after="0" w:before="0" w:line="220"/>
-            </w:pPr>
-            <w:r>
-              <w:rPr>
-                <w:rFonts w:ascii="Arial" w:cs="Arial" w:eastAsia="Arial" w:hAnsi="Arial"/>
-                <w:color w:val="5B6472"/>
-                <w:sz w:val="15"/>
-                <w:szCs w:val="15"/>
-              </w:rPr>
-              <w:t xml:space="preserve">Green Industry DMRV &amp; Carbon-Readiness Platform</w:t>
-            </w:r>
-          </w:p>
-        </w:tc>
-        <w:tc>
-          <w:tcPr>
-            <w:tcW w:type="dxa" w:w="3000"/>
-            <w:tcBorders>
-              <w:top w:val="single" w:color="CBD5E1" w:sz="4"/>
-              <w:left w:val="single" w:color="CBD5E1" w:sz="4"/>
-              <w:bottom w:val="single" w:color="CBD5E1" w:sz="4"/>
-              <w:right w:val="single" w:color="CBD5E1" w:sz="4"/>
-            </w:tcBorders>
-            <w:shd w:fill="FFFFFF" w:color="auto" w:val="clear"/>
+              <w:t xml:space="preserve">Whole portfolio</w:t>
+            </w:r>
+          </w:p>
+        </w:tc>
+        <w:tc>
+          <w:tcPr>
+            <w:tcW w:type="dxa" w:w="1450"/>
+            <w:tcBorders>
+              <w:top w:val="single" w:color="CBD5E1" w:sz="4"/>
+              <w:left w:val="single" w:color="CBD5E1" w:sz="4"/>
+              <w:bottom w:val="single" w:color="CBD5E1" w:sz="4"/>
+              <w:right w:val="single" w:color="CBD5E1" w:sz="4"/>
+            </w:tcBorders>
+            <w:shd w:fill="EAF0F7" w:color="auto" w:val="clear"/>
             <w:tcMar>
               <w:top w:type="dxa" w:w="70"/>
               <w:left w:type="dxa" w:w="110"/>
@@ -2272,29 +2129,31 @@
           </w:tcPr>
           <w:p>
             <w:pPr>
-              <w:spacing w:after="0" w:before="0" w:line="230"/>
-            </w:pPr>
-            <w:r>
-              <w:rPr>
-                <w:rFonts w:ascii="Arial" w:cs="Arial" w:eastAsia="Arial" w:hAnsi="Arial"/>
-                <w:color w:val="1F2937"/>
-                <w:sz w:val="17"/>
-                <w:szCs w:val="17"/>
-              </w:rPr>
-              <w:t xml:space="preserve">CCTS carbon targets and EU CBAM threatening jobs in heavy industry and exports</w:t>
-            </w:r>
-          </w:p>
-        </w:tc>
-        <w:tc>
-          <w:tcPr>
-            <w:tcW w:type="dxa" w:w="2050"/>
-            <w:tcBorders>
-              <w:top w:val="single" w:color="CBD5E1" w:sz="4"/>
-              <w:left w:val="single" w:color="CBD5E1" w:sz="4"/>
-              <w:bottom w:val="single" w:color="CBD5E1" w:sz="4"/>
-              <w:right w:val="single" w:color="CBD5E1" w:sz="4"/>
-            </w:tcBorders>
-            <w:shd w:fill="FFFFFF" w:color="auto" w:val="clear"/>
+              <w:spacing w:after="0" w:before="0" w:line="252"/>
+            </w:pPr>
+            <w:r>
+              <w:rPr>
+                <w:rFonts w:ascii="Arial" w:cs="Arial" w:eastAsia="Arial" w:hAnsi="Arial"/>
+                <w:b/>
+                <w:bCs/>
+                <w:color w:val="1F3A5F"/>
+                <w:sz w:val="17"/>
+                <w:szCs w:val="17"/>
+              </w:rPr>
+              <w:t xml:space="preserve">₹10.1–16.25 cr</w:t>
+            </w:r>
+          </w:p>
+        </w:tc>
+        <w:tc>
+          <w:tcPr>
+            <w:tcW w:type="dxa" w:w="1506"/>
+            <w:tcBorders>
+              <w:top w:val="single" w:color="CBD5E1" w:sz="4"/>
+              <w:left w:val="single" w:color="CBD5E1" w:sz="4"/>
+              <w:bottom w:val="single" w:color="CBD5E1" w:sz="4"/>
+              <w:right w:val="single" w:color="CBD5E1" w:sz="4"/>
+            </w:tcBorders>
+            <w:shd w:fill="EAF0F7" w:color="auto" w:val="clear"/>
             <w:tcMar>
               <w:top w:type="dxa" w:w="70"/>
               <w:left w:type="dxa" w:w="110"/>
@@ -2305,110 +2164,6 @@
           </w:tcPr>
           <w:p>
             <w:pPr>
-              <w:spacing w:after="0" w:before="0" w:line="230"/>
-            </w:pPr>
-            <w:r>
-              <w:rPr>
-                <w:rFonts w:ascii="Arial" w:cs="Arial" w:eastAsia="Arial" w:hAnsi="Arial"/>
-                <w:color w:val="1F2937"/>
-                <w:sz w:val="17"/>
-                <w:szCs w:val="17"/>
-              </w:rPr>
-              <w:t xml:space="preserve">Not started at state level; our prototype is ready</w:t>
-            </w:r>
-          </w:p>
-        </w:tc>
-        <w:tc>
-          <w:tcPr>
-            <w:tcW w:type="dxa" w:w="1450"/>
-            <w:tcBorders>
-              <w:top w:val="single" w:color="CBD5E1" w:sz="4"/>
-              <w:left w:val="single" w:color="CBD5E1" w:sz="4"/>
-              <w:bottom w:val="single" w:color="CBD5E1" w:sz="4"/>
-              <w:right w:val="single" w:color="CBD5E1" w:sz="4"/>
-            </w:tcBorders>
-            <w:shd w:fill="FFFFFF" w:color="auto" w:val="clear"/>
-            <w:tcMar>
-              <w:top w:type="dxa" w:w="70"/>
-              <w:left w:type="dxa" w:w="110"/>
-              <w:bottom w:type="dxa" w:w="70"/>
-              <w:right w:type="dxa" w:w="110"/>
-            </w:tcMar>
-            <w:vAlign w:val="top"/>
-          </w:tcPr>
-          <w:p>
-            <w:pPr>
-              <w:spacing w:after="0" w:before="0" w:line="252"/>
-            </w:pPr>
-            <w:r>
-              <w:rPr>
-                <w:rFonts w:ascii="Arial" w:cs="Arial" w:eastAsia="Arial" w:hAnsi="Arial"/>
-                <w:b/>
-                <w:bCs/>
-                <w:color w:val="1F2937"/>
-                <w:sz w:val="17"/>
-                <w:szCs w:val="17"/>
-              </w:rPr>
-              <w:t xml:space="preserve">₹1.25–2.0 cr</w:t>
-            </w:r>
-          </w:p>
-        </w:tc>
-        <w:tc>
-          <w:tcPr>
-            <w:tcW w:type="dxa" w:w="1506"/>
-            <w:tcBorders>
-              <w:top w:val="single" w:color="CBD5E1" w:sz="4"/>
-              <w:left w:val="single" w:color="CBD5E1" w:sz="4"/>
-              <w:bottom w:val="single" w:color="CBD5E1" w:sz="4"/>
-              <w:right w:val="single" w:color="CBD5E1" w:sz="4"/>
-            </w:tcBorders>
-            <w:shd w:fill="FFFFFF" w:color="auto" w:val="clear"/>
-            <w:tcMar>
-              <w:top w:type="dxa" w:w="70"/>
-              <w:left w:type="dxa" w:w="110"/>
-              <w:bottom w:type="dxa" w:w="70"/>
-              <w:right w:type="dxa" w:w="110"/>
-            </w:tcMar>
-            <w:vAlign w:val="top"/>
-          </w:tcPr>
-          <w:p>
-            <w:pPr>
-              <w:spacing w:after="0" w:before="0" w:line="252"/>
-            </w:pPr>
-            <w:r>
-              <w:rPr>
-                <w:rFonts w:ascii="Arial" w:cs="Arial" w:eastAsia="Arial" w:hAnsi="Arial"/>
-                <w:color w:val="1F2937"/>
-                <w:sz w:val="17"/>
-                <w:szCs w:val="17"/>
-              </w:rPr>
-              <w:t xml:space="preserve">₹45–75 lakh</w:t>
-            </w:r>
-          </w:p>
-        </w:tc>
-      </w:tr>
-      <w:tr>
-        <w:tc>
-          <w:tcPr>
-            <w:tcW w:type="dxa" w:w="7350"/>
-            <w:gridSpan w:val="4"/>
-            <w:tcBorders>
-              <w:top w:val="single" w:color="CBD5E1" w:sz="4"/>
-              <w:left w:val="single" w:color="CBD5E1" w:sz="4"/>
-              <w:bottom w:val="single" w:color="CBD5E1" w:sz="4"/>
-              <w:right w:val="single" w:color="CBD5E1" w:sz="4"/>
-            </w:tcBorders>
-            <w:shd w:fill="EAF0F7" w:color="auto" w:val="clear"/>
-            <w:tcMar>
-              <w:top w:type="dxa" w:w="70"/>
-              <w:left w:type="dxa" w:w="110"/>
-              <w:bottom w:type="dxa" w:w="70"/>
-              <w:right w:type="dxa" w:w="110"/>
-            </w:tcMar>
-            <w:vAlign w:val="top"/>
-          </w:tcPr>
-          <w:p>
-            <w:pPr>
               <w:spacing w:after="0" w:before="0" w:line="252"/>
             </w:pPr>
             <w:r>
@@ -2417,80 +2172,10 @@
                 <w:b/>
                 <w:bCs/>
                 <w:color w:val="1F3A5F"/>
-                <w:sz w:val="18"/>
-                <w:szCs w:val="18"/>
-              </w:rPr>
-              <w:t xml:space="preserve">Whole portfolio</w:t>
-            </w:r>
-          </w:p>
-        </w:tc>
-        <w:tc>
-          <w:tcPr>
-            <w:tcW w:type="dxa" w:w="1450"/>
-            <w:tcBorders>
-              <w:top w:val="single" w:color="CBD5E1" w:sz="4"/>
-              <w:left w:val="single" w:color="CBD5E1" w:sz="4"/>
-              <w:bottom w:val="single" w:color="CBD5E1" w:sz="4"/>
-              <w:right w:val="single" w:color="CBD5E1" w:sz="4"/>
-            </w:tcBorders>
-            <w:shd w:fill="EAF0F7" w:color="auto" w:val="clear"/>
-            <w:tcMar>
-              <w:top w:type="dxa" w:w="70"/>
-              <w:left w:type="dxa" w:w="110"/>
-              <w:bottom w:type="dxa" w:w="70"/>
-              <w:right w:type="dxa" w:w="110"/>
-            </w:tcMar>
-            <w:vAlign w:val="top"/>
-          </w:tcPr>
-          <w:p>
-            <w:pPr>
-              <w:spacing w:after="0" w:before="0" w:line="252"/>
-            </w:pPr>
-            <w:r>
-              <w:rPr>
-                <w:rFonts w:ascii="Arial" w:cs="Arial" w:eastAsia="Arial" w:hAnsi="Arial"/>
-                <w:b/>
-                <w:bCs/>
-                <w:color w:val="1F3A5F"/>
-                <w:sz w:val="17"/>
-                <w:szCs w:val="17"/>
-              </w:rPr>
-              <w:t xml:space="preserve">₹11.35–18.25 cr</w:t>
-            </w:r>
-          </w:p>
-        </w:tc>
-        <w:tc>
-          <w:tcPr>
-            <w:tcW w:type="dxa" w:w="1506"/>
-            <w:tcBorders>
-              <w:top w:val="single" w:color="CBD5E1" w:sz="4"/>
-              <w:left w:val="single" w:color="CBD5E1" w:sz="4"/>
-              <w:bottom w:val="single" w:color="CBD5E1" w:sz="4"/>
-              <w:right w:val="single" w:color="CBD5E1" w:sz="4"/>
-            </w:tcBorders>
-            <w:shd w:fill="EAF0F7" w:color="auto" w:val="clear"/>
-            <w:tcMar>
-              <w:top w:type="dxa" w:w="70"/>
-              <w:left w:type="dxa" w:w="110"/>
-              <w:bottom w:type="dxa" w:w="70"/>
-              <w:right w:type="dxa" w:w="110"/>
-            </w:tcMar>
-            <w:vAlign w:val="top"/>
-          </w:tcPr>
-          <w:p>
-            <w:pPr>
-              <w:spacing w:after="0" w:before="0" w:line="252"/>
-            </w:pPr>
-            <w:r>
-              <w:rPr>
-                <w:rFonts w:ascii="Arial" w:cs="Arial" w:eastAsia="Arial" w:hAnsi="Arial"/>
-                <w:b/>
-                <w:bCs/>
-                <w:color w:val="1F3A5F"/>
-                <w:sz w:val="17"/>
-                <w:szCs w:val="17"/>
-              </w:rPr>
-              <w:t xml:space="preserve">₹3.3–5.55 cr</w:t>
+                <w:sz w:val="17"/>
+                <w:szCs w:val="17"/>
+              </w:rPr>
+              <w:t xml:space="preserve">₹2.85–4.8 cr</w:t>
             </w:r>
           </w:p>
         </w:tc>
@@ -2540,7 +2225,7 @@
           <w:sz w:val="21"/>
           <w:szCs w:val="21"/>
         </w:rPr>
-        <w:t xml:space="preserve">HOW THE SIX FIT TOGETHER</w:t>
+        <w:t xml:space="preserve">HOW THE FIVE FIT TOGETHER</w:t>
       </w:r>
     </w:p>
     <w:p>
@@ -2565,7 +2250,7 @@
           <w:sz w:val="19"/>
           <w:szCs w:val="19"/>
         </w:rPr>
-        <w:t xml:space="preserve">Nivesh Setu (01) tracks the investor from MoU to production. Shilpa Bhumi (02) finds and clears the land. Silpa Sathi 2.0 (03) issues approvals on a clock. Karma Praman (04) pays incentives against verified jobs. Bangla Cluster Connect (05) carries the same approach to MSME clusters, and Sabuj Shilpa (06) keeps heavy industry and exporters carbon-compliant. Each can be built on its own, but they share a common investor record, sign-on and dashboard, so every one added makes the others more useful.</w:t>
+        <w:t xml:space="preserve">Nivesh Setu (01) tracks the investor from MoU to production. Shilpa Bhumi (02) finds and clears the land. Silpa Sathi 2.0 (03) issues approvals on a clock. Karma Praman (04) pays incentives against verified jobs. Bangla Cluster Connect (05) carries the same approach to MSME clusters. Each can be built on its own, but they share a common investor record, sign-on and dashboard, so every one added makes the others more useful.</w:t>
       </w:r>
     </w:p>
     <w:tbl>
@@ -2669,7 +2354,7 @@
                 <w:sz w:val="19"/>
                 <w:szCs w:val="19"/>
               </w:rPr>
-              <w:t xml:space="preserve">06 Sabuj Shilpa: </w:t>
+              <w:t xml:space="preserve">03 Silpa Sathi 2.0: </w:t>
             </w:r>
             <w:r>
               <w:rPr>
@@ -2678,7 +2363,7 @@
                 <w:sz w:val="19"/>
                 <w:szCs w:val="19"/>
               </w:rPr>
-              <w:t xml:space="preserve">fastest to show. Our DMRV prototype already works end to end, so a 20-unit pilot can go live in 8–10 weeks.</w:t>
+              <w:t xml:space="preserve">builds on work already underway. The clearance engine plugs into the portal being overhauled, and a 10-service pilot runs alongside officers in shadow mode, so there is no disruption.</w:t>
             </w:r>
           </w:p>
           <w:p>
@@ -3460,7 +3145,7 @@
                 <w:sz w:val="19"/>
                 <w:szCs w:val="19"/>
               </w:rPr>
-              <w:t xml:space="preserve">Most states track MoUs. Few, if any, publicly track them all the way to verified jobs. Nivesh Setu closes that loop with EPFO/ESIC-verified job data from Project 04, so the state can show 'MoU → factory → payroll'. It is also the shared backbone for all six projects: one Investor ID across land, approvals, incentives and grievances.</w:t>
+              <w:t xml:space="preserve">Most states track MoUs. Few, if any, publicly track them all the way to verified jobs. Nivesh Setu closes that loop with EPFO/ESIC-verified job data from Project 04, so the state can show 'MoU → factory → payroll'. It is also the shared backbone for all five initiatives: one Investor ID across land, approvals, incentives and grievances.</w:t>
             </w:r>
           </w:p>
         </w:tc>
@@ -17273,2884 +16958,6 @@
         <w:br w:type="page"/>
       </w:r>
     </w:p>
-    <w:tbl>
-      <w:tblPr>
-        <w:tblW w:type="dxa" w:w="10318"/>
-        <w:tblBorders>
-          <w:top w:val="single" w:color="auto" w:sz="4"/>
-          <w:left w:val="single" w:color="auto" w:sz="4"/>
-          <w:bottom w:val="single" w:color="auto" w:sz="4"/>
-          <w:right w:val="single" w:color="auto" w:sz="4"/>
-          <w:insideH w:val="single" w:color="auto" w:sz="4"/>
-          <w:insideV w:val="single" w:color="auto" w:sz="4"/>
-        </w:tblBorders>
-        <w:tblLayout w:type="fixed"/>
-      </w:tblPr>
-      <w:tblGrid>
-        <w:gridCol w:w="10318"/>
-      </w:tblGrid>
-      <w:tr>
-        <w:tc>
-          <w:tcPr>
-            <w:tcW w:type="dxa" w:w="10318"/>
-            <w:tcBorders>
-              <w:top w:val="none" w:color="FFFFFF" w:sz="0"/>
-              <w:left w:val="none" w:color="FFFFFF" w:sz="0"/>
-              <w:bottom w:val="none" w:color="FFFFFF" w:sz="0"/>
-              <w:right w:val="none" w:color="FFFFFF" w:sz="0"/>
-            </w:tcBorders>
-            <w:shd w:fill="1F3A5F" w:color="auto" w:val="clear"/>
-            <w:tcMar>
-              <w:top w:type="dxa" w:w="150"/>
-              <w:left w:type="dxa" w:w="110"/>
-              <w:bottom w:type="dxa" w:w="150"/>
-              <w:right w:type="dxa" w:w="110"/>
-            </w:tcMar>
-            <w:vAlign w:val="top"/>
-          </w:tcPr>
-          <w:p>
-            <w:pPr>
-              <w:spacing w:after="80" w:before="0" w:line="252"/>
-            </w:pPr>
-            <w:r>
-              <w:rPr>
-                <w:rFonts w:ascii="Arial" w:cs="Arial" w:eastAsia="Arial" w:hAnsi="Arial"/>
-                <w:b/>
-                <w:bCs/>
-                <w:color w:val="F6C27A"/>
-                <w:sz w:val="17"/>
-                <w:szCs w:val="17"/>
-              </w:rPr>
-              <w:t xml:space="preserve">INITIATIVE 06</w:t>
-            </w:r>
-          </w:p>
-          <w:p>
-            <w:pPr>
-              <w:spacing w:after="60" w:before="0" w:line="276"/>
-            </w:pPr>
-            <w:r>
-              <w:rPr>
-                <w:rFonts w:ascii="Arial" w:cs="Arial" w:eastAsia="Arial" w:hAnsi="Arial"/>
-                <w:b/>
-                <w:bCs/>
-                <w:color w:val="FFFFFF"/>
-                <w:sz w:val="38"/>
-                <w:szCs w:val="38"/>
-              </w:rPr>
-              <w:t xml:space="preserve">Sabuj Shilpa</w:t>
-            </w:r>
-            <w:r>
-              <w:rPr>
-                <w:rFonts w:ascii="Arial" w:cs="Arial" w:eastAsia="Arial" w:hAnsi="Arial"/>
-                <w:color w:val="DCE6F2"/>
-                <w:sz w:val="22"/>
-                <w:szCs w:val="22"/>
-              </w:rPr>
-              <w:t xml:space="preserve">   Green Industry DMRV &amp; Carbon-Readiness Platform</w:t>
-            </w:r>
-          </w:p>
-          <w:p>
-            <w:pPr>
-              <w:spacing w:after="0" w:before="0" w:line="252"/>
-            </w:pPr>
-            <w:r>
-              <w:rPr>
-                <w:rFonts w:ascii="Arial" w:cs="Arial" w:eastAsia="Arial" w:hAnsi="Arial"/>
-                <w:i/>
-                <w:iCs/>
-                <w:color w:val="DCE6F2"/>
-                <w:sz w:val="19"/>
-                <w:szCs w:val="19"/>
-              </w:rPr>
-              <w:t xml:space="preserve">Keep Bengal's industry compliant and export-ready, and let it earn from going green.</w:t>
-            </w:r>
-          </w:p>
-        </w:tc>
-      </w:tr>
-    </w:tbl>
-    <w:p>
-      <w:pPr>
-        <w:spacing w:after="60" w:before="0" w:line="252"/>
-      </w:pPr>
-      <w:r>
-        <w:rPr>
-          <w:rFonts w:ascii="Arial" w:cs="Arial" w:eastAsia="Arial" w:hAnsi="Arial"/>
-          <w:color w:val="1F2937"/>
-          <w:sz w:val="19"/>
-          <w:szCs w:val="19"/>
-        </w:rPr>
-        <w:t xml:space="preserve"/>
-      </w:r>
-    </w:p>
-    <w:tbl>
-      <w:tblPr>
-        <w:tblW w:type="dxa" w:w="10318"/>
-        <w:tblBorders>
-          <w:top w:val="single" w:color="auto" w:sz="4"/>
-          <w:left w:val="single" w:color="auto" w:sz="4"/>
-          <w:bottom w:val="single" w:color="auto" w:sz="4"/>
-          <w:right w:val="single" w:color="auto" w:sz="4"/>
-          <w:insideH w:val="single" w:color="auto" w:sz="4"/>
-          <w:insideV w:val="single" w:color="auto" w:sz="4"/>
-        </w:tblBorders>
-        <w:tblLayout w:type="fixed"/>
-      </w:tblPr>
-      <w:tblGrid>
-        <w:gridCol w:w="5159"/>
-        <w:gridCol w:w="5159"/>
-      </w:tblGrid>
-      <w:tr>
-        <w:tc>
-          <w:tcPr>
-            <w:tcW w:type="dxa" w:w="5159"/>
-            <w:tcBorders>
-              <w:top w:val="single" w:color="CBD5E1" w:sz="4"/>
-              <w:left w:val="single" w:color="CBD5E1" w:sz="4"/>
-              <w:bottom w:val="single" w:color="CBD5E1" w:sz="4"/>
-              <w:right w:val="single" w:color="CBD5E1" w:sz="4"/>
-            </w:tcBorders>
-            <w:shd w:fill="E6F4F1" w:color="auto" w:val="clear"/>
-            <w:tcMar>
-              <w:top w:type="dxa" w:w="70"/>
-              <w:left w:type="dxa" w:w="110"/>
-              <w:bottom w:type="dxa" w:w="70"/>
-              <w:right w:type="dxa" w:w="110"/>
-            </w:tcMar>
-            <w:vAlign w:val="top"/>
-          </w:tcPr>
-          <w:p>
-            <w:pPr>
-              <w:spacing w:after="20" w:before="0" w:line="252"/>
-            </w:pPr>
-            <w:r>
-              <w:rPr>
-                <w:rFonts w:ascii="Arial" w:cs="Arial" w:eastAsia="Arial" w:hAnsi="Arial"/>
-                <w:b/>
-                <w:bCs/>
-                <w:color w:val="0F766E"/>
-                <w:sz w:val="15"/>
-                <w:szCs w:val="15"/>
-              </w:rPr>
-              <w:t xml:space="preserve">OWNER &amp; PARTNER DEPARTMENTS</w:t>
-            </w:r>
-          </w:p>
-          <w:p>
-            <w:pPr>
-              <w:spacing w:after="0" w:before="0" w:line="230"/>
-            </w:pPr>
-            <w:r>
-              <w:rPr>
-                <w:rFonts w:ascii="Arial" w:cs="Arial" w:eastAsia="Arial" w:hAnsi="Arial"/>
-                <w:color w:val="1F2937"/>
-                <w:sz w:val="17"/>
-                <w:szCs w:val="17"/>
-              </w:rPr>
-              <w:t xml:space="preserve">ICE; Non-Conventional &amp; Renewable Energy Sources (same Minister); Environment / WBPCB. Partners: BEE, industry associations, accredited carbon verifiers</w:t>
-            </w:r>
-          </w:p>
-        </w:tc>
-        <w:tc>
-          <w:tcPr>
-            <w:tcW w:type="dxa" w:w="5159"/>
-            <w:tcBorders>
-              <w:top w:val="single" w:color="CBD5E1" w:sz="4"/>
-              <w:left w:val="single" w:color="CBD5E1" w:sz="4"/>
-              <w:bottom w:val="single" w:color="CBD5E1" w:sz="4"/>
-              <w:right w:val="single" w:color="CBD5E1" w:sz="4"/>
-            </w:tcBorders>
-            <w:shd w:fill="E6F4F1" w:color="auto" w:val="clear"/>
-            <w:tcMar>
-              <w:top w:type="dxa" w:w="70"/>
-              <w:left w:type="dxa" w:w="110"/>
-              <w:bottom w:type="dxa" w:w="70"/>
-              <w:right w:type="dxa" w:w="110"/>
-            </w:tcMar>
-            <w:vAlign w:val="top"/>
-          </w:tcPr>
-          <w:p>
-            <w:pPr>
-              <w:spacing w:after="20" w:before="0" w:line="252"/>
-            </w:pPr>
-            <w:r>
-              <w:rPr>
-                <w:rFonts w:ascii="Arial" w:cs="Arial" w:eastAsia="Arial" w:hAnsi="Arial"/>
-                <w:b/>
-                <w:bCs/>
-                <w:color w:val="0F766E"/>
-                <w:sz w:val="15"/>
-                <w:szCs w:val="15"/>
-              </w:rPr>
-              <w:t xml:space="preserve">STATUS TODAY</w:t>
-            </w:r>
-          </w:p>
-          <w:p>
-            <w:pPr>
-              <w:spacing w:after="0" w:before="0" w:line="230"/>
-            </w:pPr>
-            <w:r>
-              <w:rPr>
-                <w:rFonts w:ascii="Arial" w:cs="Arial" w:eastAsia="Arial" w:hAnsi="Arial"/>
-                <w:b/>
-                <w:bCs/>
-                <w:color w:val="1F2937"/>
-                <w:sz w:val="17"/>
-                <w:szCs w:val="17"/>
-              </w:rPr>
-              <w:t xml:space="preserve">Not started at state level; our prototype is ready. </w:t>
-            </w:r>
-            <w:r>
-              <w:rPr>
-                <w:rFonts w:ascii="Arial" w:cs="Arial" w:eastAsia="Arial" w:hAnsi="Arial"/>
-                <w:color w:val="1F2937"/>
-                <w:sz w:val="17"/>
-                <w:szCs w:val="17"/>
-              </w:rPr>
-              <w:t xml:space="preserve">The national Indian Carbon Market portal went live in March 2026. We are not aware of any state that offers its industry a service to help it comply. Our working DMRV prototype already covers onboarding → data → verification → registry.</w:t>
-            </w:r>
-          </w:p>
-        </w:tc>
-      </w:tr>
-      <w:tr>
-        <w:tc>
-          <w:tcPr>
-            <w:tcW w:type="dxa" w:w="5159"/>
-            <w:tcBorders>
-              <w:top w:val="single" w:color="CBD5E1" w:sz="4"/>
-              <w:left w:val="single" w:color="CBD5E1" w:sz="4"/>
-              <w:bottom w:val="single" w:color="CBD5E1" w:sz="4"/>
-              <w:right w:val="single" w:color="CBD5E1" w:sz="4"/>
-            </w:tcBorders>
-            <w:shd w:fill="E6F4F1" w:color="auto" w:val="clear"/>
-            <w:tcMar>
-              <w:top w:type="dxa" w:w="70"/>
-              <w:left w:type="dxa" w:w="110"/>
-              <w:bottom w:type="dxa" w:w="70"/>
-              <w:right w:type="dxa" w:w="110"/>
-            </w:tcMar>
-            <w:vAlign w:val="top"/>
-          </w:tcPr>
-          <w:p>
-            <w:pPr>
-              <w:spacing w:after="20" w:before="0" w:line="252"/>
-            </w:pPr>
-            <w:r>
-              <w:rPr>
-                <w:rFonts w:ascii="Arial" w:cs="Arial" w:eastAsia="Arial" w:hAnsi="Arial"/>
-                <w:b/>
-                <w:bCs/>
-                <w:color w:val="0F766E"/>
-                <w:sz w:val="15"/>
-                <w:szCs w:val="15"/>
-              </w:rPr>
-              <w:t xml:space="preserve">TIMELINE</w:t>
-            </w:r>
-          </w:p>
-          <w:p>
-            <w:pPr>
-              <w:spacing w:after="0" w:before="0" w:line="252"/>
-            </w:pPr>
-            <w:r>
-              <w:rPr>
-                <w:rFonts w:ascii="Arial" w:cs="Arial" w:eastAsia="Arial" w:hAnsi="Arial"/>
-                <w:color w:val="1F2937"/>
-                <w:sz w:val="17"/>
-                <w:szCs w:val="17"/>
-              </w:rPr>
-              <w:t xml:space="preserve">Pilot 8–10 weeks (20 units) · Rollout 5 months</w:t>
-            </w:r>
-          </w:p>
-        </w:tc>
-        <w:tc>
-          <w:tcPr>
-            <w:tcW w:type="dxa" w:w="5159"/>
-            <w:tcBorders>
-              <w:top w:val="single" w:color="CBD5E1" w:sz="4"/>
-              <w:left w:val="single" w:color="CBD5E1" w:sz="4"/>
-              <w:bottom w:val="single" w:color="CBD5E1" w:sz="4"/>
-              <w:right w:val="single" w:color="CBD5E1" w:sz="4"/>
-            </w:tcBorders>
-            <w:shd w:fill="E6F4F1" w:color="auto" w:val="clear"/>
-            <w:tcMar>
-              <w:top w:type="dxa" w:w="70"/>
-              <w:left w:type="dxa" w:w="110"/>
-              <w:bottom w:type="dxa" w:w="70"/>
-              <w:right w:type="dxa" w:w="110"/>
-            </w:tcMar>
-            <w:vAlign w:val="top"/>
-          </w:tcPr>
-          <w:p>
-            <w:pPr>
-              <w:spacing w:after="20" w:before="0" w:line="252"/>
-            </w:pPr>
-            <w:r>
-              <w:rPr>
-                <w:rFonts w:ascii="Arial" w:cs="Arial" w:eastAsia="Arial" w:hAnsi="Arial"/>
-                <w:b/>
-                <w:bCs/>
-                <w:color w:val="0F766E"/>
-                <w:sz w:val="15"/>
-                <w:szCs w:val="15"/>
-              </w:rPr>
-              <w:t xml:space="preserve">INDICATIVE COST</w:t>
-            </w:r>
-          </w:p>
-          <w:p>
-            <w:pPr>
-              <w:spacing w:after="0" w:before="0" w:line="252"/>
-            </w:pPr>
-            <w:r>
-              <w:rPr>
-                <w:rFonts w:ascii="Arial" w:cs="Arial" w:eastAsia="Arial" w:hAnsi="Arial"/>
-                <w:b/>
-                <w:bCs/>
-                <w:color w:val="1F2937"/>
-                <w:sz w:val="17"/>
-                <w:szCs w:val="17"/>
-              </w:rPr>
-              <w:t xml:space="preserve">One-time ₹1.25–2.0 cr</w:t>
-            </w:r>
-            <w:r>
-              <w:rPr>
-                <w:rFonts w:ascii="Arial" w:cs="Arial" w:eastAsia="Arial" w:hAnsi="Arial"/>
-                <w:color w:val="1F2937"/>
-                <w:sz w:val="17"/>
-                <w:szCs w:val="17"/>
-              </w:rPr>
-              <w:t xml:space="preserve">  ·  Recurring ₹45–75 lakh / yr</w:t>
-            </w:r>
-          </w:p>
-        </w:tc>
-      </w:tr>
-    </w:tbl>
-    <w:p>
-      <w:pPr>
-        <w:keepNext/>
-        <w:pBdr>
-          <w:bottom w:val="single" w:color="1F3A5F" w:sz="6" w:space="2"/>
-        </w:pBdr>
-        <w:spacing w:after="70" w:before="150"/>
-      </w:pPr>
-      <w:r>
-        <w:rPr>
-          <w:rFonts w:ascii="Arial" w:cs="Arial" w:eastAsia="Arial" w:hAnsi="Arial"/>
-          <w:b/>
-          <w:bCs/>
-          <w:color w:val="B45309"/>
-          <w:sz w:val="23"/>
-          <w:szCs w:val="23"/>
-        </w:rPr>
-        <w:t xml:space="preserve">1  </w:t>
-      </w:r>
-      <w:r>
-        <w:rPr>
-          <w:rFonts w:ascii="Arial" w:cs="Arial" w:eastAsia="Arial" w:hAnsi="Arial"/>
-          <w:b/>
-          <w:bCs/>
-          <w:color w:val="1F3A5F"/>
-          <w:sz w:val="21"/>
-          <w:szCs w:val="21"/>
-        </w:rPr>
-        <w:t xml:space="preserve">PROBLEM STATEMENT</w:t>
-      </w:r>
-    </w:p>
-    <w:p>
-      <w:pPr>
-        <w:pStyle w:val="ListParagraph"/>
-        <w:keepLines/>
-        <w:numPr>
-          <w:ilvl w:val="0"/>
-          <w:numId w:val="2"/>
-        </w:numPr>
-        <w:spacing w:after="40" w:line="246"/>
-      </w:pPr>
-      <w:r>
-        <w:rPr>
-          <w:rFonts w:ascii="Arial" w:cs="Arial" w:eastAsia="Arial" w:hAnsi="Arial"/>
-          <w:color w:val="1F2937"/>
-          <w:sz w:val="19"/>
-          <w:szCs w:val="19"/>
-        </w:rPr>
-        <w:t xml:space="preserve">India's Carbon Credit Trading Scheme (CCTS) is now binding. About 490 obligated entities in 7 sectors (aluminium, cement, chlor-alkali, pulp &amp; paper, refinery, petrochemicals, textiles) must cut emission intensity in FY26 and FY27. Iron &amp; steel and fertiliser targets come next, and they fall directly on the Durgapur–Asansol–Haldia belt.</w:t>
-      </w:r>
-    </w:p>
-    <w:p>
-      <w:pPr>
-        <w:pStyle w:val="ListParagraph"/>
-        <w:keepLines/>
-        <w:numPr>
-          <w:ilvl w:val="0"/>
-          <w:numId w:val="2"/>
-        </w:numPr>
-        <w:spacing w:after="40" w:line="246"/>
-      </w:pPr>
-      <w:r>
-        <w:rPr>
-          <w:rFonts w:ascii="Arial" w:cs="Arial" w:eastAsia="Arial" w:hAnsi="Arial"/>
-          <w:color w:val="1F2937"/>
-          <w:sz w:val="19"/>
-          <w:szCs w:val="19"/>
-        </w:rPr>
-        <w:t xml:space="preserve">The EU's Carbon Border Adjustment Mechanism (CBAM) entered its paid phase in January 2026. Bengal's steel, aluminium and engineering exporters, including MSME suppliers, need verified product-level emission data or they lose EU buyers.</w:t>
-      </w:r>
-    </w:p>
-    <w:p>
-      <w:pPr>
-        <w:pStyle w:val="ListParagraph"/>
-        <w:keepLines/>
-        <w:numPr>
-          <w:ilvl w:val="0"/>
-          <w:numId w:val="2"/>
-        </w:numPr>
-        <w:spacing w:after="40" w:line="246"/>
-      </w:pPr>
-      <w:r>
-        <w:rPr>
-          <w:rFonts w:ascii="Arial" w:cs="Arial" w:eastAsia="Arial" w:hAnsi="Arial"/>
-          <w:color w:val="1F2937"/>
-          <w:sz w:val="19"/>
-          <w:szCs w:val="19"/>
-        </w:rPr>
-        <w:t xml:space="preserve">Most units, and especially MSMEs and secondary steel and sponge-iron plants, lack the capacity to measure, report and verify (MRV) their emissions. Consultants are costly and the data is collected by hand.</w:t>
-      </w:r>
-    </w:p>
-    <w:p>
-      <w:pPr>
-        <w:pStyle w:val="ListParagraph"/>
-        <w:keepLines/>
-        <w:numPr>
-          <w:ilvl w:val="0"/>
-          <w:numId w:val="2"/>
-        </w:numPr>
-        <w:spacing w:after="40" w:line="246"/>
-      </w:pPr>
-      <w:r>
-        <w:rPr>
-          <w:rFonts w:ascii="Arial" w:cs="Arial" w:eastAsia="Arial" w:hAnsi="Arial"/>
-          <w:color w:val="1F2937"/>
-          <w:sz w:val="19"/>
-          <w:szCs w:val="19"/>
-        </w:rPr>
-        <w:t xml:space="preserve">WBPCB already receives online emission data (OCEMS) from red-category units, but that data is not used for economic or green-investment decisions.</w:t>
-      </w:r>
-    </w:p>
-    <w:p>
-      <w:pPr>
-        <w:keepNext/>
-        <w:pBdr>
-          <w:bottom w:val="single" w:color="1F3A5F" w:sz="6" w:space="2"/>
-        </w:pBdr>
-        <w:spacing w:after="70" w:before="150"/>
-      </w:pPr>
-      <w:r>
-        <w:rPr>
-          <w:rFonts w:ascii="Arial" w:cs="Arial" w:eastAsia="Arial" w:hAnsi="Arial"/>
-          <w:b/>
-          <w:bCs/>
-          <w:color w:val="B45309"/>
-          <w:sz w:val="23"/>
-          <w:szCs w:val="23"/>
-        </w:rPr>
-        <w:t xml:space="preserve">2  </w:t>
-      </w:r>
-      <w:r>
-        <w:rPr>
-          <w:rFonts w:ascii="Arial" w:cs="Arial" w:eastAsia="Arial" w:hAnsi="Arial"/>
-          <w:b/>
-          <w:bCs/>
-          <w:color w:val="1F3A5F"/>
-          <w:sz w:val="21"/>
-          <w:szCs w:val="21"/>
-        </w:rPr>
-        <w:t xml:space="preserve">PROPOSED SOLUTION</w:t>
-      </w:r>
-    </w:p>
-    <w:p>
-      <w:pPr>
-        <w:keepNext/>
-        <w:spacing w:after="60" w:before="0" w:line="252"/>
-      </w:pPr>
-      <w:r>
-        <w:rPr>
-          <w:rFonts w:ascii="Arial" w:cs="Arial" w:eastAsia="Arial" w:hAnsi="Arial"/>
-          <w:color w:val="1F2937"/>
-          <w:sz w:val="19"/>
-          <w:szCs w:val="19"/>
-        </w:rPr>
-        <w:t xml:space="preserve">A state-sponsored digital MRV (DMRV) service for industry, built on our existing working prototype.</w:t>
-      </w:r>
-    </w:p>
-    <w:p>
-      <w:pPr>
-        <w:pStyle w:val="ListParagraph"/>
-        <w:keepLines/>
-        <w:numPr>
-          <w:ilvl w:val="0"/>
-          <w:numId w:val="2"/>
-        </w:numPr>
-        <w:spacing w:after="40" w:line="246"/>
-      </w:pPr>
-      <w:r>
-        <w:rPr>
-          <w:rFonts w:ascii="Arial" w:cs="Arial" w:eastAsia="Arial" w:hAnsi="Arial"/>
-          <w:b/>
-          <w:bCs/>
-          <w:color w:val="1F3A5F"/>
-          <w:sz w:val="19"/>
-          <w:szCs w:val="19"/>
-        </w:rPr>
-        <w:t xml:space="preserve">Facility registry + auto-ingest: </w:t>
-      </w:r>
-      <w:r>
-        <w:rPr>
-          <w:rFonts w:ascii="Arial" w:cs="Arial" w:eastAsia="Arial" w:hAnsi="Arial"/>
-          <w:color w:val="1F2937"/>
-          <w:sz w:val="19"/>
-          <w:szCs w:val="19"/>
-        </w:rPr>
-        <w:t xml:space="preserve">Registry in CCTS format; energy bills, fuel purchases, production data and WBPCB OCEMS feeds loaded automatically.</w:t>
-      </w:r>
-    </w:p>
-    <w:p>
-      <w:pPr>
-        <w:pStyle w:val="ListParagraph"/>
-        <w:keepLines/>
-        <w:numPr>
-          <w:ilvl w:val="0"/>
-          <w:numId w:val="2"/>
-        </w:numPr>
-        <w:spacing w:after="40" w:line="246"/>
-      </w:pPr>
-      <w:r>
-        <w:rPr>
-          <w:rFonts w:ascii="Arial" w:cs="Arial" w:eastAsia="Arial" w:hAnsi="Arial"/>
-          <w:b/>
-          <w:bCs/>
-          <w:color w:val="1F3A5F"/>
-          <w:sz w:val="19"/>
-          <w:szCs w:val="19"/>
-        </w:rPr>
-        <w:t xml:space="preserve">CCTS compliance engine: </w:t>
-      </w:r>
-      <w:r>
-        <w:rPr>
-          <w:rFonts w:ascii="Arial" w:cs="Arial" w:eastAsia="Arial" w:hAnsi="Arial"/>
-          <w:color w:val="1F2937"/>
-          <w:sz w:val="19"/>
-          <w:szCs w:val="19"/>
-        </w:rPr>
-        <w:t xml:space="preserve">Emission-intensity calculation to the official methodology, alerts on the gap to target, and ready-made packs for accredited verifiers and BEE.</w:t>
-      </w:r>
-    </w:p>
-    <w:p>
-      <w:pPr>
-        <w:pStyle w:val="ListParagraph"/>
-        <w:keepLines/>
-        <w:numPr>
-          <w:ilvl w:val="0"/>
-          <w:numId w:val="2"/>
-        </w:numPr>
-        <w:spacing w:after="40" w:line="246"/>
-      </w:pPr>
-      <w:r>
-        <w:rPr>
-          <w:rFonts w:ascii="Arial" w:cs="Arial" w:eastAsia="Arial" w:hAnsi="Arial"/>
-          <w:b/>
-          <w:bCs/>
-          <w:color w:val="1F3A5F"/>
-          <w:sz w:val="19"/>
-          <w:szCs w:val="19"/>
-        </w:rPr>
-        <w:t xml:space="preserve">CBAM Export Desk: </w:t>
-      </w:r>
-      <w:r>
-        <w:rPr>
-          <w:rFonts w:ascii="Arial" w:cs="Arial" w:eastAsia="Arial" w:hAnsi="Arial"/>
-          <w:color w:val="1F2937"/>
-          <w:sz w:val="19"/>
-          <w:szCs w:val="19"/>
-        </w:rPr>
-        <w:t xml:space="preserve">Calculators for the emissions embedded in each product, and reports in the EU's format, for MSME exporters.</w:t>
-      </w:r>
-    </w:p>
-    <w:p>
-      <w:pPr>
-        <w:pStyle w:val="ListParagraph"/>
-        <w:keepLines/>
-        <w:numPr>
-          <w:ilvl w:val="0"/>
-          <w:numId w:val="2"/>
-        </w:numPr>
-        <w:spacing w:after="40" w:line="246"/>
-      </w:pPr>
-      <w:r>
-        <w:rPr>
-          <w:rFonts w:ascii="Arial" w:cs="Arial" w:eastAsia="Arial" w:hAnsi="Arial"/>
-          <w:b/>
-          <w:bCs/>
-          <w:color w:val="1F3A5F"/>
-          <w:sz w:val="19"/>
-          <w:szCs w:val="19"/>
-        </w:rPr>
-        <w:t xml:space="preserve">Green incentive link: </w:t>
-      </w:r>
-      <w:r>
-        <w:rPr>
-          <w:rFonts w:ascii="Arial" w:cs="Arial" w:eastAsia="Arial" w:hAnsi="Arial"/>
-          <w:color w:val="1F2937"/>
-          <w:sz w:val="19"/>
-          <w:szCs w:val="19"/>
-        </w:rPr>
-        <w:t xml:space="preserve">Verified reductions (rooftop solar, efficiency upgrades) qualify for state green top-ups under the new industrial policy.</w:t>
-      </w:r>
-    </w:p>
-    <w:p>
-      <w:pPr>
-        <w:pStyle w:val="ListParagraph"/>
-        <w:keepLines/>
-        <w:numPr>
-          <w:ilvl w:val="0"/>
-          <w:numId w:val="2"/>
-        </w:numPr>
-        <w:spacing w:after="40" w:line="246"/>
-      </w:pPr>
-      <w:r>
-        <w:rPr>
-          <w:rFonts w:ascii="Arial" w:cs="Arial" w:eastAsia="Arial" w:hAnsi="Arial"/>
-          <w:b/>
-          <w:bCs/>
-          <w:color w:val="1F3A5F"/>
-          <w:sz w:val="19"/>
-          <w:szCs w:val="19"/>
-        </w:rPr>
-        <w:t xml:space="preserve">State Green Industry Dashboard + aggregation: </w:t>
-      </w:r>
-      <w:r>
-        <w:rPr>
-          <w:rFonts w:ascii="Arial" w:cs="Arial" w:eastAsia="Arial" w:hAnsi="Arial"/>
-          <w:color w:val="1F2937"/>
-          <w:sz w:val="19"/>
-          <w:szCs w:val="19"/>
-        </w:rPr>
-        <w:t xml:space="preserve">A sector and district view for the Renewable Energy portfolio, and pooling of MSME efficiency gains to earn carbon credits under the offset mechanism.</w:t>
-      </w:r>
-    </w:p>
-    <w:p>
-      <w:pPr>
-        <w:spacing w:after="40" w:before="0" w:line="252"/>
-      </w:pPr>
-      <w:r>
-        <w:rPr>
-          <w:rFonts w:ascii="Arial" w:cs="Arial" w:eastAsia="Arial" w:hAnsi="Arial"/>
-          <w:color w:val="1F2937"/>
-          <w:sz w:val="19"/>
-          <w:szCs w:val="19"/>
-        </w:rPr>
-        <w:t xml:space="preserve"/>
-      </w:r>
-    </w:p>
-    <w:tbl>
-      <w:tblPr>
-        <w:tblW w:type="dxa" w:w="10318"/>
-        <w:tblBorders>
-          <w:top w:val="single" w:color="auto" w:sz="4"/>
-          <w:left w:val="single" w:color="auto" w:sz="4"/>
-          <w:bottom w:val="single" w:color="auto" w:sz="4"/>
-          <w:right w:val="single" w:color="auto" w:sz="4"/>
-          <w:insideH w:val="single" w:color="auto" w:sz="4"/>
-          <w:insideV w:val="single" w:color="auto" w:sz="4"/>
-        </w:tblBorders>
-        <w:tblLayout w:type="fixed"/>
-      </w:tblPr>
-      <w:tblGrid>
-        <w:gridCol w:w="10318"/>
-      </w:tblGrid>
-      <w:tr>
-        <w:trPr>
-          <w:cantSplit/>
-        </w:trPr>
-        <w:tc>
-          <w:tcPr>
-            <w:tcW w:type="dxa" w:w="10318"/>
-            <w:tcBorders>
-              <w:top w:val="none" w:color="FFFFFF" w:sz="0"/>
-              <w:left w:val="single" w:color="B45309" w:sz="24"/>
-              <w:bottom w:val="none" w:color="FFFFFF" w:sz="0"/>
-              <w:right w:val="none" w:color="FFFFFF" w:sz="0"/>
-            </w:tcBorders>
-            <w:shd w:fill="FDF3E4" w:color="auto" w:val="clear"/>
-            <w:tcMar>
-              <w:top w:type="dxa" w:w="100"/>
-              <w:left w:type="dxa" w:w="110"/>
-              <w:bottom w:type="dxa" w:w="100"/>
-              <w:right w:type="dxa" w:w="110"/>
-            </w:tcMar>
-            <w:vAlign w:val="top"/>
-          </w:tcPr>
-          <w:p>
-            <w:pPr>
-              <w:spacing w:after="30" w:before="0" w:line="252"/>
-            </w:pPr>
-            <w:r>
-              <w:rPr>
-                <w:rFonts w:ascii="Arial" w:cs="Arial" w:eastAsia="Arial" w:hAnsi="Arial"/>
-                <w:b/>
-                <w:bCs/>
-                <w:color w:val="B45309"/>
-                <w:sz w:val="17"/>
-                <w:szCs w:val="17"/>
-              </w:rPr>
-              <w:t xml:space="preserve">UNIQUE DIFFERENTIATOR</w:t>
-            </w:r>
-          </w:p>
-          <w:p>
-            <w:pPr>
-              <w:spacing w:after="0" w:before="0" w:line="252"/>
-            </w:pPr>
-            <w:r>
-              <w:rPr>
-                <w:rFonts w:ascii="Arial" w:cs="Arial" w:eastAsia="Arial" w:hAnsi="Arial"/>
-                <w:color w:val="1F2937"/>
-                <w:sz w:val="19"/>
-                <w:szCs w:val="19"/>
-              </w:rPr>
-              <w:t xml:space="preserve">The state provides this to its industry as a service, instead of leaving each unit to face Delhi and Brussels alone. We already have a working prototype of the full workflow (entity onboarding → data quality → calculation lineage → third-party verification → regulator approval → registry), so the pilot starts in weeks, not months.</w:t>
-            </w:r>
-          </w:p>
-        </w:tc>
-      </w:tr>
-    </w:tbl>
-    <w:p>
-      <w:pPr>
-        <w:keepNext/>
-        <w:pBdr>
-          <w:bottom w:val="single" w:color="1F3A5F" w:sz="6" w:space="2"/>
-        </w:pBdr>
-        <w:spacing w:after="70" w:before="150"/>
-      </w:pPr>
-      <w:r>
-        <w:rPr>
-          <w:rFonts w:ascii="Arial" w:cs="Arial" w:eastAsia="Arial" w:hAnsi="Arial"/>
-          <w:b/>
-          <w:bCs/>
-          <w:color w:val="B45309"/>
-          <w:sz w:val="23"/>
-          <w:szCs w:val="23"/>
-        </w:rPr>
-        <w:t xml:space="preserve">3  </w:t>
-      </w:r>
-      <w:r>
-        <w:rPr>
-          <w:rFonts w:ascii="Arial" w:cs="Arial" w:eastAsia="Arial" w:hAnsi="Arial"/>
-          <w:b/>
-          <w:bCs/>
-          <w:color w:val="1F3A5F"/>
-          <w:sz w:val="21"/>
-          <w:szCs w:val="21"/>
-        </w:rPr>
-        <w:t xml:space="preserve">APPROACH &amp; METHODOLOGY</w:t>
-      </w:r>
-    </w:p>
-    <w:tbl>
-      <w:tblPr>
-        <w:tblW w:type="dxa" w:w="10306"/>
-        <w:tblBorders>
-          <w:top w:val="single" w:color="auto" w:sz="4"/>
-          <w:left w:val="single" w:color="auto" w:sz="4"/>
-          <w:bottom w:val="single" w:color="auto" w:sz="4"/>
-          <w:right w:val="single" w:color="auto" w:sz="4"/>
-          <w:insideH w:val="single" w:color="auto" w:sz="4"/>
-          <w:insideV w:val="single" w:color="auto" w:sz="4"/>
-        </w:tblBorders>
-        <w:tblLayout w:type="fixed"/>
-      </w:tblPr>
-      <w:tblGrid>
-        <w:gridCol w:w="1500"/>
-        <w:gridCol w:w="1100"/>
-        <w:gridCol w:w="5406"/>
-        <w:gridCol w:w="2300"/>
-      </w:tblGrid>
-      <w:tr>
-        <w:trPr>
-          <w:cantSplit/>
-          <w:tblHeader/>
-        </w:trPr>
-        <w:tc>
-          <w:tcPr>
-            <w:tcW w:type="dxa" w:w="1500"/>
-            <w:tcBorders>
-              <w:top w:val="single" w:color="CBD5E1" w:sz="4"/>
-              <w:left w:val="single" w:color="CBD5E1" w:sz="4"/>
-              <w:bottom w:val="single" w:color="CBD5E1" w:sz="4"/>
-              <w:right w:val="single" w:color="CBD5E1" w:sz="4"/>
-            </w:tcBorders>
-            <w:shd w:fill="0F766E" w:color="auto" w:val="clear"/>
-            <w:tcMar>
-              <w:top w:type="dxa" w:w="50"/>
-              <w:left w:type="dxa" w:w="110"/>
-              <w:bottom w:type="dxa" w:w="50"/>
-              <w:right w:type="dxa" w:w="110"/>
-            </w:tcMar>
-            <w:vAlign w:val="top"/>
-          </w:tcPr>
-          <w:p>
-            <w:pPr>
-              <w:spacing w:after="0" w:before="0" w:line="252"/>
-            </w:pPr>
-            <w:r>
-              <w:rPr>
-                <w:rFonts w:ascii="Arial" w:cs="Arial" w:eastAsia="Arial" w:hAnsi="Arial"/>
-                <w:b/>
-                <w:bCs/>
-                <w:color w:val="FFFFFF"/>
-                <w:sz w:val="16"/>
-                <w:szCs w:val="16"/>
-              </w:rPr>
-              <w:t xml:space="preserve">Phase</w:t>
-            </w:r>
-          </w:p>
-        </w:tc>
-        <w:tc>
-          <w:tcPr>
-            <w:tcW w:type="dxa" w:w="1100"/>
-            <w:tcBorders>
-              <w:top w:val="single" w:color="CBD5E1" w:sz="4"/>
-              <w:left w:val="single" w:color="CBD5E1" w:sz="4"/>
-              <w:bottom w:val="single" w:color="CBD5E1" w:sz="4"/>
-              <w:right w:val="single" w:color="CBD5E1" w:sz="4"/>
-            </w:tcBorders>
-            <w:shd w:fill="0F766E" w:color="auto" w:val="clear"/>
-            <w:tcMar>
-              <w:top w:type="dxa" w:w="50"/>
-              <w:left w:type="dxa" w:w="110"/>
-              <w:bottom w:type="dxa" w:w="50"/>
-              <w:right w:type="dxa" w:w="110"/>
-            </w:tcMar>
-            <w:vAlign w:val="top"/>
-          </w:tcPr>
-          <w:p>
-            <w:pPr>
-              <w:spacing w:after="0" w:before="0" w:line="252"/>
-            </w:pPr>
-            <w:r>
-              <w:rPr>
-                <w:rFonts w:ascii="Arial" w:cs="Arial" w:eastAsia="Arial" w:hAnsi="Arial"/>
-                <w:b/>
-                <w:bCs/>
-                <w:color w:val="FFFFFF"/>
-                <w:sz w:val="16"/>
-                <w:szCs w:val="16"/>
-              </w:rPr>
-              <w:t xml:space="preserve">Duration</w:t>
-            </w:r>
-          </w:p>
-        </w:tc>
-        <w:tc>
-          <w:tcPr>
-            <w:tcW w:type="dxa" w:w="5406"/>
-            <w:tcBorders>
-              <w:top w:val="single" w:color="CBD5E1" w:sz="4"/>
-              <w:left w:val="single" w:color="CBD5E1" w:sz="4"/>
-              <w:bottom w:val="single" w:color="CBD5E1" w:sz="4"/>
-              <w:right w:val="single" w:color="CBD5E1" w:sz="4"/>
-            </w:tcBorders>
-            <w:shd w:fill="0F766E" w:color="auto" w:val="clear"/>
-            <w:tcMar>
-              <w:top w:type="dxa" w:w="50"/>
-              <w:left w:type="dxa" w:w="110"/>
-              <w:bottom w:type="dxa" w:w="50"/>
-              <w:right w:type="dxa" w:w="110"/>
-            </w:tcMar>
-            <w:vAlign w:val="top"/>
-          </w:tcPr>
-          <w:p>
-            <w:pPr>
-              <w:spacing w:after="0" w:before="0" w:line="252"/>
-            </w:pPr>
-            <w:r>
-              <w:rPr>
-                <w:rFonts w:ascii="Arial" w:cs="Arial" w:eastAsia="Arial" w:hAnsi="Arial"/>
-                <w:b/>
-                <w:bCs/>
-                <w:color w:val="FFFFFF"/>
-                <w:sz w:val="16"/>
-                <w:szCs w:val="16"/>
-              </w:rPr>
-              <w:t xml:space="preserve">What we do</w:t>
-            </w:r>
-          </w:p>
-        </w:tc>
-        <w:tc>
-          <w:tcPr>
-            <w:tcW w:type="dxa" w:w="2300"/>
-            <w:tcBorders>
-              <w:top w:val="single" w:color="CBD5E1" w:sz="4"/>
-              <w:left w:val="single" w:color="CBD5E1" w:sz="4"/>
-              <w:bottom w:val="single" w:color="CBD5E1" w:sz="4"/>
-              <w:right w:val="single" w:color="CBD5E1" w:sz="4"/>
-            </w:tcBorders>
-            <w:shd w:fill="0F766E" w:color="auto" w:val="clear"/>
-            <w:tcMar>
-              <w:top w:type="dxa" w:w="50"/>
-              <w:left w:type="dxa" w:w="110"/>
-              <w:bottom w:type="dxa" w:w="50"/>
-              <w:right w:type="dxa" w:w="110"/>
-            </w:tcMar>
-            <w:vAlign w:val="top"/>
-          </w:tcPr>
-          <w:p>
-            <w:pPr>
-              <w:spacing w:after="0" w:before="0" w:line="252"/>
-            </w:pPr>
-            <w:r>
-              <w:rPr>
-                <w:rFonts w:ascii="Arial" w:cs="Arial" w:eastAsia="Arial" w:hAnsi="Arial"/>
-                <w:b/>
-                <w:bCs/>
-                <w:color w:val="FFFFFF"/>
-                <w:sz w:val="16"/>
-                <w:szCs w:val="16"/>
-              </w:rPr>
-              <w:t xml:space="preserve">Output</w:t>
-            </w:r>
-          </w:p>
-        </w:tc>
-      </w:tr>
-      <w:tr>
-        <w:trPr>
-          <w:cantSplit/>
-        </w:trPr>
-        <w:tc>
-          <w:tcPr>
-            <w:tcW w:type="dxa" w:w="1500"/>
-            <w:tcBorders>
-              <w:top w:val="single" w:color="CBD5E1" w:sz="4"/>
-              <w:left w:val="single" w:color="CBD5E1" w:sz="4"/>
-              <w:bottom w:val="single" w:color="CBD5E1" w:sz="4"/>
-              <w:right w:val="single" w:color="CBD5E1" w:sz="4"/>
-            </w:tcBorders>
-            <w:shd w:fill="F7F9FC" w:color="auto" w:val="clear"/>
-            <w:tcMar>
-              <w:top w:type="dxa" w:w="50"/>
-              <w:left w:type="dxa" w:w="110"/>
-              <w:bottom w:type="dxa" w:w="50"/>
-              <w:right w:type="dxa" w:w="110"/>
-            </w:tcMar>
-            <w:vAlign w:val="top"/>
-          </w:tcPr>
-          <w:p>
-            <w:pPr>
-              <w:spacing w:after="0" w:before="0" w:line="230"/>
-            </w:pPr>
-            <w:r>
-              <w:rPr>
-                <w:rFonts w:ascii="Arial" w:cs="Arial" w:eastAsia="Arial" w:hAnsi="Arial"/>
-                <w:b/>
-                <w:bCs/>
-                <w:color w:val="1F3A5F"/>
-                <w:sz w:val="17"/>
-                <w:szCs w:val="17"/>
-              </w:rPr>
-              <w:t xml:space="preserve">0. Mobilise</w:t>
-            </w:r>
-          </w:p>
-        </w:tc>
-        <w:tc>
-          <w:tcPr>
-            <w:tcW w:type="dxa" w:w="1100"/>
-            <w:tcBorders>
-              <w:top w:val="single" w:color="CBD5E1" w:sz="4"/>
-              <w:left w:val="single" w:color="CBD5E1" w:sz="4"/>
-              <w:bottom w:val="single" w:color="CBD5E1" w:sz="4"/>
-              <w:right w:val="single" w:color="CBD5E1" w:sz="4"/>
-            </w:tcBorders>
-            <w:shd w:fill="F7F9FC" w:color="auto" w:val="clear"/>
-            <w:tcMar>
-              <w:top w:type="dxa" w:w="50"/>
-              <w:left w:type="dxa" w:w="110"/>
-              <w:bottom w:type="dxa" w:w="50"/>
-              <w:right w:type="dxa" w:w="110"/>
-            </w:tcMar>
-            <w:vAlign w:val="top"/>
-          </w:tcPr>
-          <w:p>
-            <w:pPr>
-              <w:spacing w:after="0" w:before="0" w:line="230"/>
-            </w:pPr>
-            <w:r>
-              <w:rPr>
-                <w:rFonts w:ascii="Arial" w:cs="Arial" w:eastAsia="Arial" w:hAnsi="Arial"/>
-                <w:b w:val="false"/>
-                <w:bCs w:val="false"/>
-                <w:color w:val="1F2937"/>
-                <w:sz w:val="17"/>
-                <w:szCs w:val="17"/>
-              </w:rPr>
-              <w:t xml:space="preserve">3 weeks</w:t>
-            </w:r>
-          </w:p>
-        </w:tc>
-        <w:tc>
-          <w:tcPr>
-            <w:tcW w:type="dxa" w:w="5406"/>
-            <w:tcBorders>
-              <w:top w:val="single" w:color="CBD5E1" w:sz="4"/>
-              <w:left w:val="single" w:color="CBD5E1" w:sz="4"/>
-              <w:bottom w:val="single" w:color="CBD5E1" w:sz="4"/>
-              <w:right w:val="single" w:color="CBD5E1" w:sz="4"/>
-            </w:tcBorders>
-            <w:shd w:fill="F7F9FC" w:color="auto" w:val="clear"/>
-            <w:tcMar>
-              <w:top w:type="dxa" w:w="50"/>
-              <w:left w:type="dxa" w:w="110"/>
-              <w:bottom w:type="dxa" w:w="50"/>
-              <w:right w:type="dxa" w:w="110"/>
-            </w:tcMar>
-            <w:vAlign w:val="top"/>
-          </w:tcPr>
-          <w:p>
-            <w:pPr>
-              <w:spacing w:after="0" w:before="0" w:line="230"/>
-            </w:pPr>
-            <w:r>
-              <w:rPr>
-                <w:rFonts w:ascii="Arial" w:cs="Arial" w:eastAsia="Arial" w:hAnsi="Arial"/>
-                <w:b w:val="false"/>
-                <w:bCs w:val="false"/>
-                <w:color w:val="1F2937"/>
-                <w:sz w:val="17"/>
-                <w:szCs w:val="17"/>
-              </w:rPr>
-              <w:t xml:space="preserve">List the obligated entities based in Bengal and the top 50 EU exporters; agree the OCEMS data feed with WBPCB; workshops in Durgapur and Haldia.</w:t>
-            </w:r>
-          </w:p>
-        </w:tc>
-        <w:tc>
-          <w:tcPr>
-            <w:tcW w:type="dxa" w:w="2300"/>
-            <w:tcBorders>
-              <w:top w:val="single" w:color="CBD5E1" w:sz="4"/>
-              <w:left w:val="single" w:color="CBD5E1" w:sz="4"/>
-              <w:bottom w:val="single" w:color="CBD5E1" w:sz="4"/>
-              <w:right w:val="single" w:color="CBD5E1" w:sz="4"/>
-            </w:tcBorders>
-            <w:shd w:fill="F7F9FC" w:color="auto" w:val="clear"/>
-            <w:tcMar>
-              <w:top w:type="dxa" w:w="50"/>
-              <w:left w:type="dxa" w:w="110"/>
-              <w:bottom w:type="dxa" w:w="50"/>
-              <w:right w:type="dxa" w:w="110"/>
-            </w:tcMar>
-            <w:vAlign w:val="top"/>
-          </w:tcPr>
-          <w:p>
-            <w:pPr>
-              <w:spacing w:after="0" w:before="0" w:line="230"/>
-            </w:pPr>
-            <w:r>
-              <w:rPr>
-                <w:rFonts w:ascii="Arial" w:cs="Arial" w:eastAsia="Arial" w:hAnsi="Arial"/>
-                <w:b w:val="false"/>
-                <w:bCs w:val="false"/>
-                <w:color w:val="1F2937"/>
-                <w:sz w:val="17"/>
-                <w:szCs w:val="17"/>
-              </w:rPr>
-              <w:t xml:space="preserve">Pilot cohort</w:t>
-            </w:r>
-          </w:p>
-        </w:tc>
-      </w:tr>
-      <w:tr>
-        <w:trPr>
-          <w:cantSplit/>
-        </w:trPr>
-        <w:tc>
-          <w:tcPr>
-            <w:tcW w:type="dxa" w:w="1500"/>
-            <w:tcBorders>
-              <w:top w:val="single" w:color="CBD5E1" w:sz="4"/>
-              <w:left w:val="single" w:color="CBD5E1" w:sz="4"/>
-              <w:bottom w:val="single" w:color="CBD5E1" w:sz="4"/>
-              <w:right w:val="single" w:color="CBD5E1" w:sz="4"/>
-            </w:tcBorders>
-            <w:shd w:fill="FFFFFF" w:color="auto" w:val="clear"/>
-            <w:tcMar>
-              <w:top w:type="dxa" w:w="50"/>
-              <w:left w:type="dxa" w:w="110"/>
-              <w:bottom w:type="dxa" w:w="50"/>
-              <w:right w:type="dxa" w:w="110"/>
-            </w:tcMar>
-            <w:vAlign w:val="top"/>
-          </w:tcPr>
-          <w:p>
-            <w:pPr>
-              <w:spacing w:after="0" w:before="0" w:line="230"/>
-            </w:pPr>
-            <w:r>
-              <w:rPr>
-                <w:rFonts w:ascii="Arial" w:cs="Arial" w:eastAsia="Arial" w:hAnsi="Arial"/>
-                <w:b/>
-                <w:bCs/>
-                <w:color w:val="1F3A5F"/>
-                <w:sz w:val="17"/>
-                <w:szCs w:val="17"/>
-              </w:rPr>
-              <w:t xml:space="preserve">1. Pilot</w:t>
-            </w:r>
-          </w:p>
-        </w:tc>
-        <w:tc>
-          <w:tcPr>
-            <w:tcW w:type="dxa" w:w="1100"/>
-            <w:tcBorders>
-              <w:top w:val="single" w:color="CBD5E1" w:sz="4"/>
-              <w:left w:val="single" w:color="CBD5E1" w:sz="4"/>
-              <w:bottom w:val="single" w:color="CBD5E1" w:sz="4"/>
-              <w:right w:val="single" w:color="CBD5E1" w:sz="4"/>
-            </w:tcBorders>
-            <w:shd w:fill="FFFFFF" w:color="auto" w:val="clear"/>
-            <w:tcMar>
-              <w:top w:type="dxa" w:w="50"/>
-              <w:left w:type="dxa" w:w="110"/>
-              <w:bottom w:type="dxa" w:w="50"/>
-              <w:right w:type="dxa" w:w="110"/>
-            </w:tcMar>
-            <w:vAlign w:val="top"/>
-          </w:tcPr>
-          <w:p>
-            <w:pPr>
-              <w:spacing w:after="0" w:before="0" w:line="230"/>
-            </w:pPr>
-            <w:r>
-              <w:rPr>
-                <w:rFonts w:ascii="Arial" w:cs="Arial" w:eastAsia="Arial" w:hAnsi="Arial"/>
-                <w:b w:val="false"/>
-                <w:bCs w:val="false"/>
-                <w:color w:val="1F2937"/>
-                <w:sz w:val="17"/>
-                <w:szCs w:val="17"/>
-              </w:rPr>
-              <w:t xml:space="preserve">8–10 weeks</w:t>
-            </w:r>
-          </w:p>
-        </w:tc>
-        <w:tc>
-          <w:tcPr>
-            <w:tcW w:type="dxa" w:w="5406"/>
-            <w:tcBorders>
-              <w:top w:val="single" w:color="CBD5E1" w:sz="4"/>
-              <w:left w:val="single" w:color="CBD5E1" w:sz="4"/>
-              <w:bottom w:val="single" w:color="CBD5E1" w:sz="4"/>
-              <w:right w:val="single" w:color="CBD5E1" w:sz="4"/>
-            </w:tcBorders>
-            <w:shd w:fill="FFFFFF" w:color="auto" w:val="clear"/>
-            <w:tcMar>
-              <w:top w:type="dxa" w:w="50"/>
-              <w:left w:type="dxa" w:w="110"/>
-              <w:bottom w:type="dxa" w:w="50"/>
-              <w:right w:type="dxa" w:w="110"/>
-            </w:tcMar>
-            <w:vAlign w:val="top"/>
-          </w:tcPr>
-          <w:p>
-            <w:pPr>
-              <w:spacing w:after="0" w:before="0" w:line="230"/>
-            </w:pPr>
-            <w:r>
-              <w:rPr>
-                <w:rFonts w:ascii="Arial" w:cs="Arial" w:eastAsia="Arial" w:hAnsi="Arial"/>
-                <w:b w:val="false"/>
-                <w:bCs w:val="false"/>
-                <w:color w:val="1F2937"/>
-                <w:sz w:val="17"/>
-                <w:szCs w:val="17"/>
-              </w:rPr>
-              <w:t xml:space="preserve">Configure the prototype for 20 units (large obligated entities plus MSME exporters); first CCTS and CBAM reports.</w:t>
-            </w:r>
-          </w:p>
-        </w:tc>
-        <w:tc>
-          <w:tcPr>
-            <w:tcW w:type="dxa" w:w="2300"/>
-            <w:tcBorders>
-              <w:top w:val="single" w:color="CBD5E1" w:sz="4"/>
-              <w:left w:val="single" w:color="CBD5E1" w:sz="4"/>
-              <w:bottom w:val="single" w:color="CBD5E1" w:sz="4"/>
-              <w:right w:val="single" w:color="CBD5E1" w:sz="4"/>
-            </w:tcBorders>
-            <w:shd w:fill="FFFFFF" w:color="auto" w:val="clear"/>
-            <w:tcMar>
-              <w:top w:type="dxa" w:w="50"/>
-              <w:left w:type="dxa" w:w="110"/>
-              <w:bottom w:type="dxa" w:w="50"/>
-              <w:right w:type="dxa" w:w="110"/>
-            </w:tcMar>
-            <w:vAlign w:val="top"/>
-          </w:tcPr>
-          <w:p>
-            <w:pPr>
-              <w:spacing w:after="0" w:before="0" w:line="230"/>
-            </w:pPr>
-            <w:r>
-              <w:rPr>
-                <w:rFonts w:ascii="Arial" w:cs="Arial" w:eastAsia="Arial" w:hAnsi="Arial"/>
-                <w:b w:val="false"/>
-                <w:bCs w:val="false"/>
-                <w:color w:val="1F2937"/>
-                <w:sz w:val="17"/>
-                <w:szCs w:val="17"/>
-              </w:rPr>
-              <w:t xml:space="preserve">First compliance packs</w:t>
-            </w:r>
-          </w:p>
-        </w:tc>
-      </w:tr>
-      <w:tr>
-        <w:trPr>
-          <w:cantSplit/>
-        </w:trPr>
-        <w:tc>
-          <w:tcPr>
-            <w:tcW w:type="dxa" w:w="1500"/>
-            <w:tcBorders>
-              <w:top w:val="single" w:color="CBD5E1" w:sz="4"/>
-              <w:left w:val="single" w:color="CBD5E1" w:sz="4"/>
-              <w:bottom w:val="single" w:color="CBD5E1" w:sz="4"/>
-              <w:right w:val="single" w:color="CBD5E1" w:sz="4"/>
-            </w:tcBorders>
-            <w:shd w:fill="F7F9FC" w:color="auto" w:val="clear"/>
-            <w:tcMar>
-              <w:top w:type="dxa" w:w="50"/>
-              <w:left w:type="dxa" w:w="110"/>
-              <w:bottom w:type="dxa" w:w="50"/>
-              <w:right w:type="dxa" w:w="110"/>
-            </w:tcMar>
-            <w:vAlign w:val="top"/>
-          </w:tcPr>
-          <w:p>
-            <w:pPr>
-              <w:spacing w:after="0" w:before="0" w:line="230"/>
-            </w:pPr>
-            <w:r>
-              <w:rPr>
-                <w:rFonts w:ascii="Arial" w:cs="Arial" w:eastAsia="Arial" w:hAnsi="Arial"/>
-                <w:b/>
-                <w:bCs/>
-                <w:color w:val="1F3A5F"/>
-                <w:sz w:val="17"/>
-                <w:szCs w:val="17"/>
-              </w:rPr>
-              <w:t xml:space="preserve">2. Rollout</w:t>
-            </w:r>
-          </w:p>
-        </w:tc>
-        <w:tc>
-          <w:tcPr>
-            <w:tcW w:type="dxa" w:w="1100"/>
-            <w:tcBorders>
-              <w:top w:val="single" w:color="CBD5E1" w:sz="4"/>
-              <w:left w:val="single" w:color="CBD5E1" w:sz="4"/>
-              <w:bottom w:val="single" w:color="CBD5E1" w:sz="4"/>
-              <w:right w:val="single" w:color="CBD5E1" w:sz="4"/>
-            </w:tcBorders>
-            <w:shd w:fill="F7F9FC" w:color="auto" w:val="clear"/>
-            <w:tcMar>
-              <w:top w:type="dxa" w:w="50"/>
-              <w:left w:type="dxa" w:w="110"/>
-              <w:bottom w:type="dxa" w:w="50"/>
-              <w:right w:type="dxa" w:w="110"/>
-            </w:tcMar>
-            <w:vAlign w:val="top"/>
-          </w:tcPr>
-          <w:p>
-            <w:pPr>
-              <w:spacing w:after="0" w:before="0" w:line="230"/>
-            </w:pPr>
-            <w:r>
-              <w:rPr>
-                <w:rFonts w:ascii="Arial" w:cs="Arial" w:eastAsia="Arial" w:hAnsi="Arial"/>
-                <w:b w:val="false"/>
-                <w:bCs w:val="false"/>
-                <w:color w:val="1F2937"/>
-                <w:sz w:val="17"/>
-                <w:szCs w:val="17"/>
-              </w:rPr>
-              <w:t xml:space="preserve">5 months</w:t>
-            </w:r>
-          </w:p>
-        </w:tc>
-        <w:tc>
-          <w:tcPr>
-            <w:tcW w:type="dxa" w:w="5406"/>
-            <w:tcBorders>
-              <w:top w:val="single" w:color="CBD5E1" w:sz="4"/>
-              <w:left w:val="single" w:color="CBD5E1" w:sz="4"/>
-              <w:bottom w:val="single" w:color="CBD5E1" w:sz="4"/>
-              <w:right w:val="single" w:color="CBD5E1" w:sz="4"/>
-            </w:tcBorders>
-            <w:shd w:fill="F7F9FC" w:color="auto" w:val="clear"/>
-            <w:tcMar>
-              <w:top w:type="dxa" w:w="50"/>
-              <w:left w:type="dxa" w:w="110"/>
-              <w:bottom w:type="dxa" w:w="50"/>
-              <w:right w:type="dxa" w:w="110"/>
-            </w:tcMar>
-            <w:vAlign w:val="top"/>
-          </w:tcPr>
-          <w:p>
-            <w:pPr>
-              <w:spacing w:after="0" w:before="0" w:line="230"/>
-            </w:pPr>
-            <w:r>
-              <w:rPr>
-                <w:rFonts w:ascii="Arial" w:cs="Arial" w:eastAsia="Arial" w:hAnsi="Arial"/>
-                <w:b w:val="false"/>
-                <w:bCs w:val="false"/>
-                <w:color w:val="1F2937"/>
-                <w:sz w:val="17"/>
-                <w:szCs w:val="17"/>
-              </w:rPr>
-              <w:t xml:space="preserve">All willing obligated entities plus 500 MSMEs; aggregation; dashboard; incentive link.</w:t>
-            </w:r>
-          </w:p>
-        </w:tc>
-        <w:tc>
-          <w:tcPr>
-            <w:tcW w:type="dxa" w:w="2300"/>
-            <w:tcBorders>
-              <w:top w:val="single" w:color="CBD5E1" w:sz="4"/>
-              <w:left w:val="single" w:color="CBD5E1" w:sz="4"/>
-              <w:bottom w:val="single" w:color="CBD5E1" w:sz="4"/>
-              <w:right w:val="single" w:color="CBD5E1" w:sz="4"/>
-            </w:tcBorders>
-            <w:shd w:fill="F7F9FC" w:color="auto" w:val="clear"/>
-            <w:tcMar>
-              <w:top w:type="dxa" w:w="50"/>
-              <w:left w:type="dxa" w:w="110"/>
-              <w:bottom w:type="dxa" w:w="50"/>
-              <w:right w:type="dxa" w:w="110"/>
-            </w:tcMar>
-            <w:vAlign w:val="top"/>
-          </w:tcPr>
-          <w:p>
-            <w:pPr>
-              <w:spacing w:after="0" w:before="0" w:line="230"/>
-            </w:pPr>
-            <w:r>
-              <w:rPr>
-                <w:rFonts w:ascii="Arial" w:cs="Arial" w:eastAsia="Arial" w:hAnsi="Arial"/>
-                <w:b w:val="false"/>
-                <w:bCs w:val="false"/>
-                <w:color w:val="1F2937"/>
-                <w:sz w:val="17"/>
-                <w:szCs w:val="17"/>
-              </w:rPr>
-              <w:t xml:space="preserve">State DMRV service</w:t>
-            </w:r>
-          </w:p>
-        </w:tc>
-      </w:tr>
-      <w:tr>
-        <w:trPr>
-          <w:cantSplit/>
-        </w:trPr>
-        <w:tc>
-          <w:tcPr>
-            <w:tcW w:type="dxa" w:w="1500"/>
-            <w:tcBorders>
-              <w:top w:val="single" w:color="CBD5E1" w:sz="4"/>
-              <w:left w:val="single" w:color="CBD5E1" w:sz="4"/>
-              <w:bottom w:val="single" w:color="CBD5E1" w:sz="4"/>
-              <w:right w:val="single" w:color="CBD5E1" w:sz="4"/>
-            </w:tcBorders>
-            <w:shd w:fill="FFFFFF" w:color="auto" w:val="clear"/>
-            <w:tcMar>
-              <w:top w:type="dxa" w:w="50"/>
-              <w:left w:type="dxa" w:w="110"/>
-              <w:bottom w:type="dxa" w:w="50"/>
-              <w:right w:type="dxa" w:w="110"/>
-            </w:tcMar>
-            <w:vAlign w:val="top"/>
-          </w:tcPr>
-          <w:p>
-            <w:pPr>
-              <w:spacing w:after="0" w:before="0" w:line="230"/>
-            </w:pPr>
-            <w:r>
-              <w:rPr>
-                <w:rFonts w:ascii="Arial" w:cs="Arial" w:eastAsia="Arial" w:hAnsi="Arial"/>
-                <w:b/>
-                <w:bCs/>
-                <w:color w:val="1F3A5F"/>
-                <w:sz w:val="17"/>
-                <w:szCs w:val="17"/>
-              </w:rPr>
-              <w:t xml:space="preserve">3. Sustain</w:t>
-            </w:r>
-          </w:p>
-        </w:tc>
-        <w:tc>
-          <w:tcPr>
-            <w:tcW w:type="dxa" w:w="1100"/>
-            <w:tcBorders>
-              <w:top w:val="single" w:color="CBD5E1" w:sz="4"/>
-              <w:left w:val="single" w:color="CBD5E1" w:sz="4"/>
-              <w:bottom w:val="single" w:color="CBD5E1" w:sz="4"/>
-              <w:right w:val="single" w:color="CBD5E1" w:sz="4"/>
-            </w:tcBorders>
-            <w:shd w:fill="FFFFFF" w:color="auto" w:val="clear"/>
-            <w:tcMar>
-              <w:top w:type="dxa" w:w="50"/>
-              <w:left w:type="dxa" w:w="110"/>
-              <w:bottom w:type="dxa" w:w="50"/>
-              <w:right w:type="dxa" w:w="110"/>
-            </w:tcMar>
-            <w:vAlign w:val="top"/>
-          </w:tcPr>
-          <w:p>
-            <w:pPr>
-              <w:spacing w:after="0" w:before="0" w:line="230"/>
-            </w:pPr>
-            <w:r>
-              <w:rPr>
-                <w:rFonts w:ascii="Arial" w:cs="Arial" w:eastAsia="Arial" w:hAnsi="Arial"/>
-                <w:b w:val="false"/>
-                <w:bCs w:val="false"/>
-                <w:color w:val="1F2937"/>
-                <w:sz w:val="17"/>
-                <w:szCs w:val="17"/>
-              </w:rPr>
-              <w:t xml:space="preserve">Ongoing</w:t>
-            </w:r>
-          </w:p>
-        </w:tc>
-        <w:tc>
-          <w:tcPr>
-            <w:tcW w:type="dxa" w:w="5406"/>
-            <w:tcBorders>
-              <w:top w:val="single" w:color="CBD5E1" w:sz="4"/>
-              <w:left w:val="single" w:color="CBD5E1" w:sz="4"/>
-              <w:bottom w:val="single" w:color="CBD5E1" w:sz="4"/>
-              <w:right w:val="single" w:color="CBD5E1" w:sz="4"/>
-            </w:tcBorders>
-            <w:shd w:fill="FFFFFF" w:color="auto" w:val="clear"/>
-            <w:tcMar>
-              <w:top w:type="dxa" w:w="50"/>
-              <w:left w:type="dxa" w:w="110"/>
-              <w:bottom w:type="dxa" w:w="50"/>
-              <w:right w:type="dxa" w:w="110"/>
-            </w:tcMar>
-            <w:vAlign w:val="top"/>
-          </w:tcPr>
-          <w:p>
-            <w:pPr>
-              <w:spacing w:after="0" w:before="0" w:line="230"/>
-            </w:pPr>
-            <w:r>
-              <w:rPr>
-                <w:rFonts w:ascii="Arial" w:cs="Arial" w:eastAsia="Arial" w:hAnsi="Arial"/>
-                <w:b w:val="false"/>
-                <w:bCs w:val="false"/>
-                <w:color w:val="1F2937"/>
-                <w:sz w:val="17"/>
-                <w:szCs w:val="17"/>
-              </w:rPr>
-              <w:t xml:space="preserve">Large units pay a modest subscription; the state funds access for MSMEs.</w:t>
-            </w:r>
-          </w:p>
-        </w:tc>
-        <w:tc>
-          <w:tcPr>
-            <w:tcW w:type="dxa" w:w="2300"/>
-            <w:tcBorders>
-              <w:top w:val="single" w:color="CBD5E1" w:sz="4"/>
-              <w:left w:val="single" w:color="CBD5E1" w:sz="4"/>
-              <w:bottom w:val="single" w:color="CBD5E1" w:sz="4"/>
-              <w:right w:val="single" w:color="CBD5E1" w:sz="4"/>
-            </w:tcBorders>
-            <w:shd w:fill="FFFFFF" w:color="auto" w:val="clear"/>
-            <w:tcMar>
-              <w:top w:type="dxa" w:w="50"/>
-              <w:left w:type="dxa" w:w="110"/>
-              <w:bottom w:type="dxa" w:w="50"/>
-              <w:right w:type="dxa" w:w="110"/>
-            </w:tcMar>
-            <w:vAlign w:val="top"/>
-          </w:tcPr>
-          <w:p>
-            <w:pPr>
-              <w:spacing w:after="0" w:before="0" w:line="230"/>
-            </w:pPr>
-            <w:r>
-              <w:rPr>
-                <w:rFonts w:ascii="Arial" w:cs="Arial" w:eastAsia="Arial" w:hAnsi="Arial"/>
-                <w:b w:val="false"/>
-                <w:bCs w:val="false"/>
-                <w:color w:val="1F2937"/>
-                <w:sz w:val="17"/>
-                <w:szCs w:val="17"/>
-              </w:rPr>
-              <w:t xml:space="preserve">Self-funding core</w:t>
-            </w:r>
-          </w:p>
-        </w:tc>
-      </w:tr>
-    </w:tbl>
-    <w:p>
-      <w:pPr>
-        <w:spacing w:after="0" w:before="60" w:line="252"/>
-      </w:pPr>
-      <w:r>
-        <w:rPr>
-          <w:rFonts w:ascii="Arial" w:cs="Arial" w:eastAsia="Arial" w:hAnsi="Arial"/>
-          <w:b/>
-          <w:bCs/>
-          <w:color w:val="1F3A5F"/>
-          <w:sz w:val="19"/>
-          <w:szCs w:val="19"/>
-        </w:rPr>
-        <w:t xml:space="preserve">Method: </w:t>
-      </w:r>
-      <w:r>
-        <w:rPr>
-          <w:rFonts w:ascii="Arial" w:cs="Arial" w:eastAsia="Arial" w:hAnsi="Arial"/>
-          <w:color w:val="1F2937"/>
-          <w:sz w:val="19"/>
-          <w:szCs w:val="19"/>
-        </w:rPr>
-        <w:t xml:space="preserve">Methodologies aligned with BEE and CCTS, a full audit trail and lineage for every calculated number, and optional IoT energy meters for high-emitting units. Data stays within India.</w:t>
-      </w:r>
-    </w:p>
-    <w:p>
-      <w:pPr>
-        <w:keepNext/>
-        <w:pBdr>
-          <w:bottom w:val="single" w:color="1F3A5F" w:sz="6" w:space="2"/>
-        </w:pBdr>
-        <w:spacing w:after="70" w:before="150"/>
-      </w:pPr>
-      <w:r>
-        <w:rPr>
-          <w:rFonts w:ascii="Arial" w:cs="Arial" w:eastAsia="Arial" w:hAnsi="Arial"/>
-          <w:b/>
-          <w:bCs/>
-          <w:color w:val="B45309"/>
-          <w:sz w:val="23"/>
-          <w:szCs w:val="23"/>
-        </w:rPr>
-        <w:t xml:space="preserve">4  </w:t>
-      </w:r>
-      <w:r>
-        <w:rPr>
-          <w:rFonts w:ascii="Arial" w:cs="Arial" w:eastAsia="Arial" w:hAnsi="Arial"/>
-          <w:b/>
-          <w:bCs/>
-          <w:color w:val="1F3A5F"/>
-          <w:sz w:val="21"/>
-          <w:szCs w:val="21"/>
-        </w:rPr>
-        <w:t xml:space="preserve">BENEFITS</w:t>
-      </w:r>
-    </w:p>
-    <w:tbl>
-      <w:tblPr>
-        <w:tblW w:type="dxa" w:w="10318"/>
-        <w:tblBorders>
-          <w:top w:val="single" w:color="auto" w:sz="4"/>
-          <w:left w:val="single" w:color="auto" w:sz="4"/>
-          <w:bottom w:val="single" w:color="auto" w:sz="4"/>
-          <w:right w:val="single" w:color="auto" w:sz="4"/>
-          <w:insideH w:val="single" w:color="auto" w:sz="4"/>
-          <w:insideV w:val="single" w:color="auto" w:sz="4"/>
-        </w:tblBorders>
-        <w:tblLayout w:type="fixed"/>
-      </w:tblPr>
-      <w:tblGrid>
-        <w:gridCol w:w="5159"/>
-        <w:gridCol w:w="5159"/>
-      </w:tblGrid>
-      <w:tr>
-        <w:trPr>
-          <w:cantSplit/>
-        </w:trPr>
-        <w:tc>
-          <w:tcPr>
-            <w:tcW w:type="dxa" w:w="5159"/>
-            <w:tcBorders>
-              <w:top w:val="single" w:color="CBD5E1" w:sz="4"/>
-              <w:left w:val="none" w:color="FFFFFF" w:sz="0"/>
-              <w:bottom w:val="none" w:color="FFFFFF" w:sz="0"/>
-              <w:right w:val="none" w:color="FFFFFF" w:sz="0"/>
-            </w:tcBorders>
-            <w:tcMar>
-              <w:top w:type="dxa" w:w="70"/>
-              <w:left w:type="dxa" w:w="110"/>
-              <w:bottom w:type="dxa" w:w="70"/>
-              <w:right w:type="dxa" w:w="110"/>
-            </w:tcMar>
-            <w:vAlign w:val="top"/>
-          </w:tcPr>
-          <w:p>
-            <w:pPr>
-              <w:spacing w:after="40" w:before="0" w:line="252"/>
-            </w:pPr>
-            <w:r>
-              <w:rPr>
-                <w:rFonts w:ascii="Arial" w:cs="Arial" w:eastAsia="Arial" w:hAnsi="Arial"/>
-                <w:b/>
-                <w:bCs/>
-                <w:color w:val="0F766E"/>
-                <w:sz w:val="18"/>
-                <w:szCs w:val="18"/>
-              </w:rPr>
-              <w:t xml:space="preserve">For the Government</w:t>
-            </w:r>
-          </w:p>
-          <w:p>
-            <w:pPr>
-              <w:pStyle w:val="ListParagraph"/>
-              <w:keepLines/>
-              <w:numPr>
-                <w:ilvl w:val="0"/>
-                <w:numId w:val="2"/>
-              </w:numPr>
-              <w:spacing w:after="40" w:line="246"/>
-            </w:pPr>
-            <w:r>
-              <w:rPr>
-                <w:rFonts w:ascii="Arial" w:cs="Arial" w:eastAsia="Arial" w:hAnsi="Arial"/>
-                <w:color w:val="1F2937"/>
-                <w:sz w:val="19"/>
-                <w:szCs w:val="19"/>
-              </w:rPr>
-              <w:t xml:space="preserve">The state's first industrial carbon map, useful for climate finance and for promoting green investment.</w:t>
-            </w:r>
-          </w:p>
-          <w:p>
-            <w:pPr>
-              <w:pStyle w:val="ListParagraph"/>
-              <w:keepLines/>
-              <w:numPr>
-                <w:ilvl w:val="0"/>
-                <w:numId w:val="2"/>
-              </w:numPr>
-              <w:spacing w:after="40" w:line="246"/>
-            </w:pPr>
-            <w:r>
-              <w:rPr>
-                <w:rFonts w:ascii="Arial" w:cs="Arial" w:eastAsia="Arial" w:hAnsi="Arial"/>
-                <w:color w:val="1F2937"/>
-                <w:sz w:val="19"/>
-                <w:szCs w:val="19"/>
-              </w:rPr>
-              <w:t xml:space="preserve">Keeps export jobs in the Durgapur–Asansol and Howrah engineering belts.</w:t>
-            </w:r>
-          </w:p>
-          <w:p>
-            <w:pPr>
-              <w:pStyle w:val="ListParagraph"/>
-              <w:keepLines/>
-              <w:numPr>
-                <w:ilvl w:val="0"/>
-                <w:numId w:val="2"/>
-              </w:numPr>
-              <w:spacing w:after="40" w:line="246"/>
-            </w:pPr>
-            <w:r>
-              <w:rPr>
-                <w:rFonts w:ascii="Arial" w:cs="Arial" w:eastAsia="Arial" w:hAnsi="Arial"/>
-                <w:color w:val="1F2937"/>
-                <w:sz w:val="19"/>
-                <w:szCs w:val="19"/>
-              </w:rPr>
-              <w:t xml:space="preserve">Low long-term cost to the state, because subscriptions and aggregation fees pay for the service.</w:t>
-            </w:r>
-          </w:p>
-        </w:tc>
-        <w:tc>
-          <w:tcPr>
-            <w:tcW w:type="dxa" w:w="5159"/>
-            <w:tcBorders>
-              <w:top w:val="single" w:color="CBD5E1" w:sz="4"/>
-              <w:left w:val="none" w:color="FFFFFF" w:sz="0"/>
-              <w:bottom w:val="none" w:color="FFFFFF" w:sz="0"/>
-              <w:right w:val="none" w:color="FFFFFF" w:sz="0"/>
-            </w:tcBorders>
-            <w:tcMar>
-              <w:top w:type="dxa" w:w="70"/>
-              <w:left w:type="dxa" w:w="110"/>
-              <w:bottom w:type="dxa" w:w="70"/>
-              <w:right w:type="dxa" w:w="110"/>
-            </w:tcMar>
-            <w:vAlign w:val="top"/>
-          </w:tcPr>
-          <w:p>
-            <w:pPr>
-              <w:spacing w:after="40" w:before="0" w:line="252"/>
-            </w:pPr>
-            <w:r>
-              <w:rPr>
-                <w:rFonts w:ascii="Arial" w:cs="Arial" w:eastAsia="Arial" w:hAnsi="Arial"/>
-                <w:b/>
-                <w:bCs/>
-                <w:color w:val="0F766E"/>
-                <w:sz w:val="18"/>
-                <w:szCs w:val="18"/>
-              </w:rPr>
-              <w:t xml:space="preserve">For industry, MSMEs &amp; citizens</w:t>
-            </w:r>
-          </w:p>
-          <w:p>
-            <w:pPr>
-              <w:pStyle w:val="ListParagraph"/>
-              <w:keepLines/>
-              <w:numPr>
-                <w:ilvl w:val="0"/>
-                <w:numId w:val="2"/>
-              </w:numPr>
-              <w:spacing w:after="40" w:line="246"/>
-            </w:pPr>
-            <w:r>
-              <w:rPr>
-                <w:rFonts w:ascii="Arial" w:cs="Arial" w:eastAsia="Arial" w:hAnsi="Arial"/>
-                <w:color w:val="1F2937"/>
-                <w:sz w:val="19"/>
-                <w:szCs w:val="19"/>
-              </w:rPr>
-              <w:t xml:space="preserve">Obligated units avoid penalties and can earn and sell Carbon Credit Certificates.</w:t>
-            </w:r>
-          </w:p>
-          <w:p>
-            <w:pPr>
-              <w:pStyle w:val="ListParagraph"/>
-              <w:keepLines/>
-              <w:numPr>
-                <w:ilvl w:val="0"/>
-                <w:numId w:val="2"/>
-              </w:numPr>
-              <w:spacing w:after="40" w:line="246"/>
-            </w:pPr>
-            <w:r>
-              <w:rPr>
-                <w:rFonts w:ascii="Arial" w:cs="Arial" w:eastAsia="Arial" w:hAnsi="Arial"/>
-                <w:color w:val="1F2937"/>
-                <w:sz w:val="19"/>
-                <w:szCs w:val="19"/>
-              </w:rPr>
-              <w:t xml:space="preserve">MSMEs keep their EU orders under CBAM.</w:t>
-            </w:r>
-          </w:p>
-          <w:p>
-            <w:pPr>
-              <w:pStyle w:val="ListParagraph"/>
-              <w:keepLines/>
-              <w:numPr>
-                <w:ilvl w:val="0"/>
-                <w:numId w:val="2"/>
-              </w:numPr>
-              <w:spacing w:after="40" w:line="246"/>
-            </w:pPr>
-            <w:r>
-              <w:rPr>
-                <w:rFonts w:ascii="Arial" w:cs="Arial" w:eastAsia="Arial" w:hAnsi="Arial"/>
-                <w:color w:val="1F2937"/>
-                <w:sz w:val="19"/>
-                <w:szCs w:val="19"/>
-              </w:rPr>
-              <w:t xml:space="preserve">Compliance at a fraction of what a consultant would charge.</w:t>
-            </w:r>
-          </w:p>
-        </w:tc>
-      </w:tr>
-    </w:tbl>
-    <w:p>
-      <w:pPr>
-        <w:keepNext/>
-        <w:pBdr>
-          <w:bottom w:val="single" w:color="1F3A5F" w:sz="6" w:space="2"/>
-        </w:pBdr>
-        <w:spacing w:after="70" w:before="150"/>
-      </w:pPr>
-      <w:r>
-        <w:rPr>
-          <w:rFonts w:ascii="Arial" w:cs="Arial" w:eastAsia="Arial" w:hAnsi="Arial"/>
-          <w:b/>
-          <w:bCs/>
-          <w:color w:val="B45309"/>
-          <w:sz w:val="23"/>
-          <w:szCs w:val="23"/>
-        </w:rPr>
-        <w:t xml:space="preserve">5  </w:t>
-      </w:r>
-      <w:r>
-        <w:rPr>
-          <w:rFonts w:ascii="Arial" w:cs="Arial" w:eastAsia="Arial" w:hAnsi="Arial"/>
-          <w:b/>
-          <w:bCs/>
-          <w:color w:val="1F3A5F"/>
-          <w:sz w:val="21"/>
-          <w:szCs w:val="21"/>
-        </w:rPr>
-        <w:t xml:space="preserve">LIKELY COST RANGE (DEVELOPMENT + INFRASTRUCTURE)</w:t>
-      </w:r>
-    </w:p>
-    <w:tbl>
-      <w:tblPr>
-        <w:tblW w:type="dxa" w:w="10306"/>
-        <w:tblBorders>
-          <w:top w:val="single" w:color="auto" w:sz="4"/>
-          <w:left w:val="single" w:color="auto" w:sz="4"/>
-          <w:bottom w:val="single" w:color="auto" w:sz="4"/>
-          <w:right w:val="single" w:color="auto" w:sz="4"/>
-          <w:insideH w:val="single" w:color="auto" w:sz="4"/>
-          <w:insideV w:val="single" w:color="auto" w:sz="4"/>
-        </w:tblBorders>
-        <w:tblLayout w:type="fixed"/>
-      </w:tblPr>
-      <w:tblGrid>
-        <w:gridCol w:w="5306"/>
-        <w:gridCol w:w="2500"/>
-        <w:gridCol w:w="2500"/>
-      </w:tblGrid>
-      <w:tr>
-        <w:trPr>
-          <w:cantSplit/>
-          <w:tblHeader/>
-        </w:trPr>
-        <w:tc>
-          <w:tcPr>
-            <w:tcW w:type="dxa" w:w="5306"/>
-            <w:tcBorders>
-              <w:top w:val="single" w:color="CBD5E1" w:sz="4"/>
-              <w:left w:val="single" w:color="CBD5E1" w:sz="4"/>
-              <w:bottom w:val="single" w:color="CBD5E1" w:sz="4"/>
-              <w:right w:val="single" w:color="CBD5E1" w:sz="4"/>
-            </w:tcBorders>
-            <w:shd w:fill="0F766E" w:color="auto" w:val="clear"/>
-            <w:tcMar>
-              <w:top w:type="dxa" w:w="45"/>
-              <w:left w:type="dxa" w:w="110"/>
-              <w:bottom w:type="dxa" w:w="45"/>
-              <w:right w:type="dxa" w:w="110"/>
-            </w:tcMar>
-            <w:vAlign w:val="top"/>
-          </w:tcPr>
-          <w:p>
-            <w:pPr>
-              <w:spacing w:after="0" w:before="0" w:line="252"/>
-            </w:pPr>
-            <w:r>
-              <w:rPr>
-                <w:rFonts w:ascii="Arial" w:cs="Arial" w:eastAsia="Arial" w:hAnsi="Arial"/>
-                <w:b/>
-                <w:bCs/>
-                <w:color w:val="FFFFFF"/>
-                <w:sz w:val="16"/>
-                <w:szCs w:val="16"/>
-              </w:rPr>
-              <w:t xml:space="preserve">Component</w:t>
-            </w:r>
-          </w:p>
-        </w:tc>
-        <w:tc>
-          <w:tcPr>
-            <w:tcW w:type="dxa" w:w="2500"/>
-            <w:tcBorders>
-              <w:top w:val="single" w:color="CBD5E1" w:sz="4"/>
-              <w:left w:val="single" w:color="CBD5E1" w:sz="4"/>
-              <w:bottom w:val="single" w:color="CBD5E1" w:sz="4"/>
-              <w:right w:val="single" w:color="CBD5E1" w:sz="4"/>
-            </w:tcBorders>
-            <w:shd w:fill="0F766E" w:color="auto" w:val="clear"/>
-            <w:tcMar>
-              <w:top w:type="dxa" w:w="45"/>
-              <w:left w:type="dxa" w:w="110"/>
-              <w:bottom w:type="dxa" w:w="45"/>
-              <w:right w:type="dxa" w:w="110"/>
-            </w:tcMar>
-            <w:vAlign w:val="top"/>
-          </w:tcPr>
-          <w:p>
-            <w:pPr>
-              <w:spacing w:after="0" w:before="0" w:line="252"/>
-              <w:jc w:val="right"/>
-            </w:pPr>
-            <w:r>
-              <w:rPr>
-                <w:rFonts w:ascii="Arial" w:cs="Arial" w:eastAsia="Arial" w:hAnsi="Arial"/>
-                <w:b/>
-                <w:bCs/>
-                <w:color w:val="FFFFFF"/>
-                <w:sz w:val="16"/>
-                <w:szCs w:val="16"/>
-              </w:rPr>
-              <w:t xml:space="preserve">Low</w:t>
-            </w:r>
-          </w:p>
-        </w:tc>
-        <w:tc>
-          <w:tcPr>
-            <w:tcW w:type="dxa" w:w="2500"/>
-            <w:tcBorders>
-              <w:top w:val="single" w:color="CBD5E1" w:sz="4"/>
-              <w:left w:val="single" w:color="CBD5E1" w:sz="4"/>
-              <w:bottom w:val="single" w:color="CBD5E1" w:sz="4"/>
-              <w:right w:val="single" w:color="CBD5E1" w:sz="4"/>
-            </w:tcBorders>
-            <w:shd w:fill="0F766E" w:color="auto" w:val="clear"/>
-            <w:tcMar>
-              <w:top w:type="dxa" w:w="45"/>
-              <w:left w:type="dxa" w:w="110"/>
-              <w:bottom w:type="dxa" w:w="45"/>
-              <w:right w:type="dxa" w:w="110"/>
-            </w:tcMar>
-            <w:vAlign w:val="top"/>
-          </w:tcPr>
-          <w:p>
-            <w:pPr>
-              <w:spacing w:after="0" w:before="0" w:line="252"/>
-              <w:jc w:val="right"/>
-            </w:pPr>
-            <w:r>
-              <w:rPr>
-                <w:rFonts w:ascii="Arial" w:cs="Arial" w:eastAsia="Arial" w:hAnsi="Arial"/>
-                <w:b/>
-                <w:bCs/>
-                <w:color w:val="FFFFFF"/>
-                <w:sz w:val="16"/>
-                <w:szCs w:val="16"/>
-              </w:rPr>
-              <w:t xml:space="preserve">High</w:t>
-            </w:r>
-          </w:p>
-        </w:tc>
-      </w:tr>
-      <w:tr>
-        <w:trPr>
-          <w:cantSplit/>
-        </w:trPr>
-        <w:tc>
-          <w:tcPr>
-            <w:tcW w:type="dxa" w:w="5306"/>
-            <w:tcBorders>
-              <w:top w:val="single" w:color="CBD5E1" w:sz="4"/>
-              <w:left w:val="single" w:color="CBD5E1" w:sz="4"/>
-              <w:bottom w:val="single" w:color="CBD5E1" w:sz="4"/>
-              <w:right w:val="single" w:color="CBD5E1" w:sz="4"/>
-            </w:tcBorders>
-            <w:tcMar>
-              <w:top w:type="dxa" w:w="45"/>
-              <w:left w:type="dxa" w:w="110"/>
-              <w:bottom w:type="dxa" w:w="45"/>
-              <w:right w:type="dxa" w:w="110"/>
-            </w:tcMar>
-            <w:vAlign w:val="top"/>
-          </w:tcPr>
-          <w:p>
-            <w:pPr>
-              <w:spacing w:after="0" w:before="0" w:line="252"/>
-            </w:pPr>
-            <w:r>
-              <w:rPr>
-                <w:rFonts w:ascii="Arial" w:cs="Arial" w:eastAsia="Arial" w:hAnsi="Arial"/>
-                <w:color w:val="1F2937"/>
-                <w:sz w:val="17"/>
-                <w:szCs w:val="17"/>
-              </w:rPr>
-              <w:t xml:space="preserve">Development: pilot (Phases 0–1)</w:t>
-            </w:r>
-          </w:p>
-        </w:tc>
-        <w:tc>
-          <w:tcPr>
-            <w:tcW w:type="dxa" w:w="2500"/>
-            <w:tcBorders>
-              <w:top w:val="single" w:color="CBD5E1" w:sz="4"/>
-              <w:left w:val="single" w:color="CBD5E1" w:sz="4"/>
-              <w:bottom w:val="single" w:color="CBD5E1" w:sz="4"/>
-              <w:right w:val="single" w:color="CBD5E1" w:sz="4"/>
-            </w:tcBorders>
-            <w:tcMar>
-              <w:top w:type="dxa" w:w="45"/>
-              <w:left w:type="dxa" w:w="110"/>
-              <w:bottom w:type="dxa" w:w="45"/>
-              <w:right w:type="dxa" w:w="110"/>
-            </w:tcMar>
-            <w:vAlign w:val="top"/>
-          </w:tcPr>
-          <w:p>
-            <w:pPr>
-              <w:spacing w:after="0" w:before="0" w:line="252"/>
-              <w:jc w:val="right"/>
-            </w:pPr>
-            <w:r>
-              <w:rPr>
-                <w:rFonts w:ascii="Arial" w:cs="Arial" w:eastAsia="Arial" w:hAnsi="Arial"/>
-                <w:color w:val="1F2937"/>
-                <w:sz w:val="17"/>
-                <w:szCs w:val="17"/>
-              </w:rPr>
-              <w:t xml:space="preserve">₹25 lakh</w:t>
-            </w:r>
-          </w:p>
-        </w:tc>
-        <w:tc>
-          <w:tcPr>
-            <w:tcW w:type="dxa" w:w="2500"/>
-            <w:tcBorders>
-              <w:top w:val="single" w:color="CBD5E1" w:sz="4"/>
-              <w:left w:val="single" w:color="CBD5E1" w:sz="4"/>
-              <w:bottom w:val="single" w:color="CBD5E1" w:sz="4"/>
-              <w:right w:val="single" w:color="CBD5E1" w:sz="4"/>
-            </w:tcBorders>
-            <w:tcMar>
-              <w:top w:type="dxa" w:w="45"/>
-              <w:left w:type="dxa" w:w="110"/>
-              <w:bottom w:type="dxa" w:w="45"/>
-              <w:right w:type="dxa" w:w="110"/>
-            </w:tcMar>
-            <w:vAlign w:val="top"/>
-          </w:tcPr>
-          <w:p>
-            <w:pPr>
-              <w:spacing w:after="0" w:before="0" w:line="252"/>
-              <w:jc w:val="right"/>
-            </w:pPr>
-            <w:r>
-              <w:rPr>
-                <w:rFonts w:ascii="Arial" w:cs="Arial" w:eastAsia="Arial" w:hAnsi="Arial"/>
-                <w:color w:val="1F2937"/>
-                <w:sz w:val="17"/>
-                <w:szCs w:val="17"/>
-              </w:rPr>
-              <w:t xml:space="preserve">₹40 lakh</w:t>
-            </w:r>
-          </w:p>
-        </w:tc>
-      </w:tr>
-      <w:tr>
-        <w:trPr>
-          <w:cantSplit/>
-        </w:trPr>
-        <w:tc>
-          <w:tcPr>
-            <w:tcW w:type="dxa" w:w="5306"/>
-            <w:tcBorders>
-              <w:top w:val="single" w:color="CBD5E1" w:sz="4"/>
-              <w:left w:val="single" w:color="CBD5E1" w:sz="4"/>
-              <w:bottom w:val="single" w:color="CBD5E1" w:sz="4"/>
-              <w:right w:val="single" w:color="CBD5E1" w:sz="4"/>
-            </w:tcBorders>
-            <w:tcMar>
-              <w:top w:type="dxa" w:w="45"/>
-              <w:left w:type="dxa" w:w="110"/>
-              <w:bottom w:type="dxa" w:w="45"/>
-              <w:right w:type="dxa" w:w="110"/>
-            </w:tcMar>
-            <w:vAlign w:val="top"/>
-          </w:tcPr>
-          <w:p>
-            <w:pPr>
-              <w:spacing w:after="0" w:before="0" w:line="252"/>
-            </w:pPr>
-            <w:r>
-              <w:rPr>
-                <w:rFonts w:ascii="Arial" w:cs="Arial" w:eastAsia="Arial" w:hAnsi="Arial"/>
-                <w:color w:val="1F2937"/>
-                <w:sz w:val="17"/>
-                <w:szCs w:val="17"/>
-              </w:rPr>
-              <w:t xml:space="preserve">Development: full rollout (Phase 2), incl. security audit</w:t>
-            </w:r>
-          </w:p>
-        </w:tc>
-        <w:tc>
-          <w:tcPr>
-            <w:tcW w:type="dxa" w:w="2500"/>
-            <w:tcBorders>
-              <w:top w:val="single" w:color="CBD5E1" w:sz="4"/>
-              <w:left w:val="single" w:color="CBD5E1" w:sz="4"/>
-              <w:bottom w:val="single" w:color="CBD5E1" w:sz="4"/>
-              <w:right w:val="single" w:color="CBD5E1" w:sz="4"/>
-            </w:tcBorders>
-            <w:tcMar>
-              <w:top w:type="dxa" w:w="45"/>
-              <w:left w:type="dxa" w:w="110"/>
-              <w:bottom w:type="dxa" w:w="45"/>
-              <w:right w:type="dxa" w:w="110"/>
-            </w:tcMar>
-            <w:vAlign w:val="top"/>
-          </w:tcPr>
-          <w:p>
-            <w:pPr>
-              <w:spacing w:after="0" w:before="0" w:line="252"/>
-              <w:jc w:val="right"/>
-            </w:pPr>
-            <w:r>
-              <w:rPr>
-                <w:rFonts w:ascii="Arial" w:cs="Arial" w:eastAsia="Arial" w:hAnsi="Arial"/>
-                <w:color w:val="1F2937"/>
-                <w:sz w:val="17"/>
-                <w:szCs w:val="17"/>
-              </w:rPr>
-              <w:t xml:space="preserve">₹1.0 cr</w:t>
-            </w:r>
-          </w:p>
-        </w:tc>
-        <w:tc>
-          <w:tcPr>
-            <w:tcW w:type="dxa" w:w="2500"/>
-            <w:tcBorders>
-              <w:top w:val="single" w:color="CBD5E1" w:sz="4"/>
-              <w:left w:val="single" w:color="CBD5E1" w:sz="4"/>
-              <w:bottom w:val="single" w:color="CBD5E1" w:sz="4"/>
-              <w:right w:val="single" w:color="CBD5E1" w:sz="4"/>
-            </w:tcBorders>
-            <w:tcMar>
-              <w:top w:type="dxa" w:w="45"/>
-              <w:left w:type="dxa" w:w="110"/>
-              <w:bottom w:type="dxa" w:w="45"/>
-              <w:right w:type="dxa" w:w="110"/>
-            </w:tcMar>
-            <w:vAlign w:val="top"/>
-          </w:tcPr>
-          <w:p>
-            <w:pPr>
-              <w:spacing w:after="0" w:before="0" w:line="252"/>
-              <w:jc w:val="right"/>
-            </w:pPr>
-            <w:r>
-              <w:rPr>
-                <w:rFonts w:ascii="Arial" w:cs="Arial" w:eastAsia="Arial" w:hAnsi="Arial"/>
-                <w:color w:val="1F2937"/>
-                <w:sz w:val="17"/>
-                <w:szCs w:val="17"/>
-              </w:rPr>
-              <w:t xml:space="preserve">₹1.6 cr</w:t>
-            </w:r>
-          </w:p>
-        </w:tc>
-      </w:tr>
-      <w:tr>
-        <w:trPr>
-          <w:cantSplit/>
-        </w:trPr>
-        <w:tc>
-          <w:tcPr>
-            <w:tcW w:type="dxa" w:w="5306"/>
-            <w:tcBorders>
-              <w:top w:val="single" w:color="CBD5E1" w:sz="4"/>
-              <w:left w:val="single" w:color="CBD5E1" w:sz="4"/>
-              <w:bottom w:val="single" w:color="CBD5E1" w:sz="4"/>
-              <w:right w:val="single" w:color="CBD5E1" w:sz="4"/>
-            </w:tcBorders>
-            <w:shd w:fill="EAF0F7" w:color="auto" w:val="clear"/>
-            <w:tcMar>
-              <w:top w:type="dxa" w:w="45"/>
-              <w:left w:type="dxa" w:w="110"/>
-              <w:bottom w:type="dxa" w:w="45"/>
-              <w:right w:type="dxa" w:w="110"/>
-            </w:tcMar>
-            <w:vAlign w:val="top"/>
-          </w:tcPr>
-          <w:p>
-            <w:pPr>
-              <w:spacing w:after="0" w:before="0" w:line="252"/>
-            </w:pPr>
-            <w:r>
-              <w:rPr>
-                <w:rFonts w:ascii="Arial" w:cs="Arial" w:eastAsia="Arial" w:hAnsi="Arial"/>
-                <w:b/>
-                <w:bCs/>
-                <w:color w:val="1F3A5F"/>
-                <w:sz w:val="17"/>
-                <w:szCs w:val="17"/>
-              </w:rPr>
-              <w:t xml:space="preserve">One-time total</w:t>
-            </w:r>
-          </w:p>
-        </w:tc>
-        <w:tc>
-          <w:tcPr>
-            <w:tcW w:type="dxa" w:w="2500"/>
-            <w:tcBorders>
-              <w:top w:val="single" w:color="CBD5E1" w:sz="4"/>
-              <w:left w:val="single" w:color="CBD5E1" w:sz="4"/>
-              <w:bottom w:val="single" w:color="CBD5E1" w:sz="4"/>
-              <w:right w:val="single" w:color="CBD5E1" w:sz="4"/>
-            </w:tcBorders>
-            <w:shd w:fill="EAF0F7" w:color="auto" w:val="clear"/>
-            <w:tcMar>
-              <w:top w:type="dxa" w:w="45"/>
-              <w:left w:type="dxa" w:w="110"/>
-              <w:bottom w:type="dxa" w:w="45"/>
-              <w:right w:type="dxa" w:w="110"/>
-            </w:tcMar>
-            <w:vAlign w:val="top"/>
-          </w:tcPr>
-          <w:p>
-            <w:pPr>
-              <w:spacing w:after="0" w:before="0" w:line="252"/>
-              <w:jc w:val="right"/>
-            </w:pPr>
-            <w:r>
-              <w:rPr>
-                <w:rFonts w:ascii="Arial" w:cs="Arial" w:eastAsia="Arial" w:hAnsi="Arial"/>
-                <w:b/>
-                <w:bCs/>
-                <w:color w:val="1F2937"/>
-                <w:sz w:val="17"/>
-                <w:szCs w:val="17"/>
-              </w:rPr>
-              <w:t xml:space="preserve">₹1.25 cr</w:t>
-            </w:r>
-          </w:p>
-        </w:tc>
-        <w:tc>
-          <w:tcPr>
-            <w:tcW w:type="dxa" w:w="2500"/>
-            <w:tcBorders>
-              <w:top w:val="single" w:color="CBD5E1" w:sz="4"/>
-              <w:left w:val="single" w:color="CBD5E1" w:sz="4"/>
-              <w:bottom w:val="single" w:color="CBD5E1" w:sz="4"/>
-              <w:right w:val="single" w:color="CBD5E1" w:sz="4"/>
-            </w:tcBorders>
-            <w:shd w:fill="EAF0F7" w:color="auto" w:val="clear"/>
-            <w:tcMar>
-              <w:top w:type="dxa" w:w="45"/>
-              <w:left w:type="dxa" w:w="110"/>
-              <w:bottom w:type="dxa" w:w="45"/>
-              <w:right w:type="dxa" w:w="110"/>
-            </w:tcMar>
-            <w:vAlign w:val="top"/>
-          </w:tcPr>
-          <w:p>
-            <w:pPr>
-              <w:spacing w:after="0" w:before="0" w:line="252"/>
-              <w:jc w:val="right"/>
-            </w:pPr>
-            <w:r>
-              <w:rPr>
-                <w:rFonts w:ascii="Arial" w:cs="Arial" w:eastAsia="Arial" w:hAnsi="Arial"/>
-                <w:b/>
-                <w:bCs/>
-                <w:color w:val="1F2937"/>
-                <w:sz w:val="17"/>
-                <w:szCs w:val="17"/>
-              </w:rPr>
-              <w:t xml:space="preserve">₹2.0 cr</w:t>
-            </w:r>
-          </w:p>
-        </w:tc>
-      </w:tr>
-      <w:tr>
-        <w:trPr>
-          <w:cantSplit/>
-        </w:trPr>
-        <w:tc>
-          <w:tcPr>
-            <w:tcW w:type="dxa" w:w="5306"/>
-            <w:tcBorders>
-              <w:top w:val="single" w:color="CBD5E1" w:sz="4"/>
-              <w:left w:val="single" w:color="CBD5E1" w:sz="4"/>
-              <w:bottom w:val="single" w:color="CBD5E1" w:sz="4"/>
-              <w:right w:val="single" w:color="CBD5E1" w:sz="4"/>
-            </w:tcBorders>
-            <w:tcMar>
-              <w:top w:type="dxa" w:w="45"/>
-              <w:left w:type="dxa" w:w="110"/>
-              <w:bottom w:type="dxa" w:w="45"/>
-              <w:right w:type="dxa" w:w="110"/>
-            </w:tcMar>
-            <w:vAlign w:val="top"/>
-          </w:tcPr>
-          <w:p>
-            <w:pPr>
-              <w:spacing w:after="0" w:before="0" w:line="252"/>
-            </w:pPr>
-            <w:r>
-              <w:rPr>
-                <w:rFonts w:ascii="Arial" w:cs="Arial" w:eastAsia="Arial" w:hAnsi="Arial"/>
-                <w:color w:val="1F2937"/>
-                <w:sz w:val="17"/>
-                <w:szCs w:val="17"/>
-              </w:rPr>
-              <w:t xml:space="preserve">Infrastructure per year (hosting, storage, gateways, data)</w:t>
-            </w:r>
-          </w:p>
-        </w:tc>
-        <w:tc>
-          <w:tcPr>
-            <w:tcW w:type="dxa" w:w="2500"/>
-            <w:tcBorders>
-              <w:top w:val="single" w:color="CBD5E1" w:sz="4"/>
-              <w:left w:val="single" w:color="CBD5E1" w:sz="4"/>
-              <w:bottom w:val="single" w:color="CBD5E1" w:sz="4"/>
-              <w:right w:val="single" w:color="CBD5E1" w:sz="4"/>
-            </w:tcBorders>
-            <w:tcMar>
-              <w:top w:type="dxa" w:w="45"/>
-              <w:left w:type="dxa" w:w="110"/>
-              <w:bottom w:type="dxa" w:w="45"/>
-              <w:right w:type="dxa" w:w="110"/>
-            </w:tcMar>
-            <w:vAlign w:val="top"/>
-          </w:tcPr>
-          <w:p>
-            <w:pPr>
-              <w:spacing w:after="0" w:before="0" w:line="252"/>
-              <w:jc w:val="right"/>
-            </w:pPr>
-            <w:r>
-              <w:rPr>
-                <w:rFonts w:ascii="Arial" w:cs="Arial" w:eastAsia="Arial" w:hAnsi="Arial"/>
-                <w:color w:val="1F2937"/>
-                <w:sz w:val="17"/>
-                <w:szCs w:val="17"/>
-              </w:rPr>
-              <w:t xml:space="preserve">₹20 lakh</w:t>
-            </w:r>
-          </w:p>
-        </w:tc>
-        <w:tc>
-          <w:tcPr>
-            <w:tcW w:type="dxa" w:w="2500"/>
-            <w:tcBorders>
-              <w:top w:val="single" w:color="CBD5E1" w:sz="4"/>
-              <w:left w:val="single" w:color="CBD5E1" w:sz="4"/>
-              <w:bottom w:val="single" w:color="CBD5E1" w:sz="4"/>
-              <w:right w:val="single" w:color="CBD5E1" w:sz="4"/>
-            </w:tcBorders>
-            <w:tcMar>
-              <w:top w:type="dxa" w:w="45"/>
-              <w:left w:type="dxa" w:w="110"/>
-              <w:bottom w:type="dxa" w:w="45"/>
-              <w:right w:type="dxa" w:w="110"/>
-            </w:tcMar>
-            <w:vAlign w:val="top"/>
-          </w:tcPr>
-          <w:p>
-            <w:pPr>
-              <w:spacing w:after="0" w:before="0" w:line="252"/>
-              <w:jc w:val="right"/>
-            </w:pPr>
-            <w:r>
-              <w:rPr>
-                <w:rFonts w:ascii="Arial" w:cs="Arial" w:eastAsia="Arial" w:hAnsi="Arial"/>
-                <w:color w:val="1F2937"/>
-                <w:sz w:val="17"/>
-                <w:szCs w:val="17"/>
-              </w:rPr>
-              <w:t xml:space="preserve">₹35 lakh</w:t>
-            </w:r>
-          </w:p>
-        </w:tc>
-      </w:tr>
-      <w:tr>
-        <w:trPr>
-          <w:cantSplit/>
-        </w:trPr>
-        <w:tc>
-          <w:tcPr>
-            <w:tcW w:type="dxa" w:w="5306"/>
-            <w:tcBorders>
-              <w:top w:val="single" w:color="CBD5E1" w:sz="4"/>
-              <w:left w:val="single" w:color="CBD5E1" w:sz="4"/>
-              <w:bottom w:val="single" w:color="CBD5E1" w:sz="4"/>
-              <w:right w:val="single" w:color="CBD5E1" w:sz="4"/>
-            </w:tcBorders>
-            <w:tcMar>
-              <w:top w:type="dxa" w:w="45"/>
-              <w:left w:type="dxa" w:w="110"/>
-              <w:bottom w:type="dxa" w:w="45"/>
-              <w:right w:type="dxa" w:w="110"/>
-            </w:tcMar>
-            <w:vAlign w:val="top"/>
-          </w:tcPr>
-          <w:p>
-            <w:pPr>
-              <w:spacing w:after="0" w:before="0" w:line="252"/>
-            </w:pPr>
-            <w:r>
-              <w:rPr>
-                <w:rFonts w:ascii="Arial" w:cs="Arial" w:eastAsia="Arial" w:hAnsi="Arial"/>
-                <w:color w:val="1F2937"/>
-                <w:sz w:val="17"/>
-                <w:szCs w:val="17"/>
-              </w:rPr>
-              <w:t xml:space="preserve">Operations &amp; maintenance per year (support, updates, helpdesk)</w:t>
-            </w:r>
-          </w:p>
-        </w:tc>
-        <w:tc>
-          <w:tcPr>
-            <w:tcW w:type="dxa" w:w="2500"/>
-            <w:tcBorders>
-              <w:top w:val="single" w:color="CBD5E1" w:sz="4"/>
-              <w:left w:val="single" w:color="CBD5E1" w:sz="4"/>
-              <w:bottom w:val="single" w:color="CBD5E1" w:sz="4"/>
-              <w:right w:val="single" w:color="CBD5E1" w:sz="4"/>
-            </w:tcBorders>
-            <w:tcMar>
-              <w:top w:type="dxa" w:w="45"/>
-              <w:left w:type="dxa" w:w="110"/>
-              <w:bottom w:type="dxa" w:w="45"/>
-              <w:right w:type="dxa" w:w="110"/>
-            </w:tcMar>
-            <w:vAlign w:val="top"/>
-          </w:tcPr>
-          <w:p>
-            <w:pPr>
-              <w:spacing w:after="0" w:before="0" w:line="252"/>
-              <w:jc w:val="right"/>
-            </w:pPr>
-            <w:r>
-              <w:rPr>
-                <w:rFonts w:ascii="Arial" w:cs="Arial" w:eastAsia="Arial" w:hAnsi="Arial"/>
-                <w:color w:val="1F2937"/>
-                <w:sz w:val="17"/>
-                <w:szCs w:val="17"/>
-              </w:rPr>
-              <w:t xml:space="preserve">₹25 lakh</w:t>
-            </w:r>
-          </w:p>
-        </w:tc>
-        <w:tc>
-          <w:tcPr>
-            <w:tcW w:type="dxa" w:w="2500"/>
-            <w:tcBorders>
-              <w:top w:val="single" w:color="CBD5E1" w:sz="4"/>
-              <w:left w:val="single" w:color="CBD5E1" w:sz="4"/>
-              <w:bottom w:val="single" w:color="CBD5E1" w:sz="4"/>
-              <w:right w:val="single" w:color="CBD5E1" w:sz="4"/>
-            </w:tcBorders>
-            <w:tcMar>
-              <w:top w:type="dxa" w:w="45"/>
-              <w:left w:type="dxa" w:w="110"/>
-              <w:bottom w:type="dxa" w:w="45"/>
-              <w:right w:type="dxa" w:w="110"/>
-            </w:tcMar>
-            <w:vAlign w:val="top"/>
-          </w:tcPr>
-          <w:p>
-            <w:pPr>
-              <w:spacing w:after="0" w:before="0" w:line="252"/>
-              <w:jc w:val="right"/>
-            </w:pPr>
-            <w:r>
-              <w:rPr>
-                <w:rFonts w:ascii="Arial" w:cs="Arial" w:eastAsia="Arial" w:hAnsi="Arial"/>
-                <w:color w:val="1F2937"/>
-                <w:sz w:val="17"/>
-                <w:szCs w:val="17"/>
-              </w:rPr>
-              <w:t xml:space="preserve">₹40 lakh</w:t>
-            </w:r>
-          </w:p>
-        </w:tc>
-      </w:tr>
-      <w:tr>
-        <w:trPr>
-          <w:cantSplit/>
-        </w:trPr>
-        <w:tc>
-          <w:tcPr>
-            <w:tcW w:type="dxa" w:w="5306"/>
-            <w:tcBorders>
-              <w:top w:val="single" w:color="CBD5E1" w:sz="4"/>
-              <w:left w:val="single" w:color="CBD5E1" w:sz="4"/>
-              <w:bottom w:val="single" w:color="CBD5E1" w:sz="4"/>
-              <w:right w:val="single" w:color="CBD5E1" w:sz="4"/>
-            </w:tcBorders>
-            <w:shd w:fill="EAF0F7" w:color="auto" w:val="clear"/>
-            <w:tcMar>
-              <w:top w:type="dxa" w:w="45"/>
-              <w:left w:type="dxa" w:w="110"/>
-              <w:bottom w:type="dxa" w:w="45"/>
-              <w:right w:type="dxa" w:w="110"/>
-            </w:tcMar>
-            <w:vAlign w:val="top"/>
-          </w:tcPr>
-          <w:p>
-            <w:pPr>
-              <w:spacing w:after="0" w:before="0" w:line="252"/>
-            </w:pPr>
-            <w:r>
-              <w:rPr>
-                <w:rFonts w:ascii="Arial" w:cs="Arial" w:eastAsia="Arial" w:hAnsi="Arial"/>
-                <w:b/>
-                <w:bCs/>
-                <w:color w:val="1F3A5F"/>
-                <w:sz w:val="17"/>
-                <w:szCs w:val="17"/>
-              </w:rPr>
-              <w:t xml:space="preserve">Recurring total per year</w:t>
-            </w:r>
-          </w:p>
-        </w:tc>
-        <w:tc>
-          <w:tcPr>
-            <w:tcW w:type="dxa" w:w="2500"/>
-            <w:tcBorders>
-              <w:top w:val="single" w:color="CBD5E1" w:sz="4"/>
-              <w:left w:val="single" w:color="CBD5E1" w:sz="4"/>
-              <w:bottom w:val="single" w:color="CBD5E1" w:sz="4"/>
-              <w:right w:val="single" w:color="CBD5E1" w:sz="4"/>
-            </w:tcBorders>
-            <w:shd w:fill="EAF0F7" w:color="auto" w:val="clear"/>
-            <w:tcMar>
-              <w:top w:type="dxa" w:w="45"/>
-              <w:left w:type="dxa" w:w="110"/>
-              <w:bottom w:type="dxa" w:w="45"/>
-              <w:right w:type="dxa" w:w="110"/>
-            </w:tcMar>
-            <w:vAlign w:val="top"/>
-          </w:tcPr>
-          <w:p>
-            <w:pPr>
-              <w:spacing w:after="0" w:before="0" w:line="252"/>
-              <w:jc w:val="right"/>
-            </w:pPr>
-            <w:r>
-              <w:rPr>
-                <w:rFonts w:ascii="Arial" w:cs="Arial" w:eastAsia="Arial" w:hAnsi="Arial"/>
-                <w:b/>
-                <w:bCs/>
-                <w:color w:val="1F2937"/>
-                <w:sz w:val="17"/>
-                <w:szCs w:val="17"/>
-              </w:rPr>
-              <w:t xml:space="preserve">₹45 lakh</w:t>
-            </w:r>
-          </w:p>
-        </w:tc>
-        <w:tc>
-          <w:tcPr>
-            <w:tcW w:type="dxa" w:w="2500"/>
-            <w:tcBorders>
-              <w:top w:val="single" w:color="CBD5E1" w:sz="4"/>
-              <w:left w:val="single" w:color="CBD5E1" w:sz="4"/>
-              <w:bottom w:val="single" w:color="CBD5E1" w:sz="4"/>
-              <w:right w:val="single" w:color="CBD5E1" w:sz="4"/>
-            </w:tcBorders>
-            <w:shd w:fill="EAF0F7" w:color="auto" w:val="clear"/>
-            <w:tcMar>
-              <w:top w:type="dxa" w:w="45"/>
-              <w:left w:type="dxa" w:w="110"/>
-              <w:bottom w:type="dxa" w:w="45"/>
-              <w:right w:type="dxa" w:w="110"/>
-            </w:tcMar>
-            <w:vAlign w:val="top"/>
-          </w:tcPr>
-          <w:p>
-            <w:pPr>
-              <w:spacing w:after="0" w:before="0" w:line="252"/>
-              <w:jc w:val="right"/>
-            </w:pPr>
-            <w:r>
-              <w:rPr>
-                <w:rFonts w:ascii="Arial" w:cs="Arial" w:eastAsia="Arial" w:hAnsi="Arial"/>
-                <w:b/>
-                <w:bCs/>
-                <w:color w:val="1F2937"/>
-                <w:sz w:val="17"/>
-                <w:szCs w:val="17"/>
-              </w:rPr>
-              <w:t xml:space="preserve">₹75 lakh</w:t>
-            </w:r>
-          </w:p>
-        </w:tc>
-      </w:tr>
-    </w:tbl>
-    <w:p>
-      <w:pPr>
-        <w:spacing w:after="0" w:before="50" w:line="252"/>
-      </w:pPr>
-      <w:r>
-        <w:rPr>
-          <w:rFonts w:ascii="Arial" w:cs="Arial" w:eastAsia="Arial" w:hAnsi="Arial"/>
-          <w:i/>
-          <w:iCs/>
-          <w:color w:val="5B6472"/>
-          <w:sz w:val="16"/>
-          <w:szCs w:val="16"/>
-        </w:rPr>
-        <w:t xml:space="preserve">Lower than a greenfield build because the core prototype exists. Optional IoT energy meters cost ₹0.5–2 lakh per unit, borne by the industry or subsidised. Figures exclude GST and are ±25% until scoped.</w:t>
-      </w:r>
-    </w:p>
-    <w:p>
-      <w:pPr>
-        <w:keepNext/>
-        <w:pBdr>
-          <w:bottom w:val="single" w:color="1F3A5F" w:sz="6" w:space="2"/>
-        </w:pBdr>
-        <w:spacing w:after="70" w:before="150"/>
-      </w:pPr>
-      <w:r>
-        <w:rPr>
-          <w:rFonts w:ascii="Arial" w:cs="Arial" w:eastAsia="Arial" w:hAnsi="Arial"/>
-          <w:b/>
-          <w:bCs/>
-          <w:color w:val="B45309"/>
-          <w:sz w:val="23"/>
-          <w:szCs w:val="23"/>
-        </w:rPr>
-        <w:t xml:space="preserve">6  </w:t>
-      </w:r>
-      <w:r>
-        <w:rPr>
-          <w:rFonts w:ascii="Arial" w:cs="Arial" w:eastAsia="Arial" w:hAnsi="Arial"/>
-          <w:b/>
-          <w:bCs/>
-          <w:color w:val="1F3A5F"/>
-          <w:sz w:val="21"/>
-          <w:szCs w:val="21"/>
-        </w:rPr>
-        <w:t xml:space="preserve">KEY RISKS &amp; HOW WE HANDLE THEM</w:t>
-      </w:r>
-    </w:p>
-    <w:tbl>
-      <w:tblPr>
-        <w:tblW w:type="dxa" w:w="10318"/>
-        <w:tblBorders>
-          <w:top w:val="single" w:color="auto" w:sz="4"/>
-          <w:left w:val="single" w:color="auto" w:sz="4"/>
-          <w:bottom w:val="single" w:color="auto" w:sz="4"/>
-          <w:right w:val="single" w:color="auto" w:sz="4"/>
-          <w:insideH w:val="single" w:color="auto" w:sz="4"/>
-          <w:insideV w:val="single" w:color="auto" w:sz="4"/>
-        </w:tblBorders>
-        <w:tblLayout w:type="fixed"/>
-      </w:tblPr>
-      <w:tblGrid>
-        <w:gridCol w:w="3600"/>
-        <w:gridCol w:w="6718"/>
-      </w:tblGrid>
-      <w:tr>
-        <w:trPr>
-          <w:cantSplit/>
-        </w:trPr>
-        <w:tc>
-          <w:tcPr>
-            <w:tcW w:type="dxa" w:w="3600"/>
-            <w:tcBorders>
-              <w:top w:val="none" w:color="FFFFFF" w:sz="0"/>
-              <w:left w:val="none" w:color="FFFFFF" w:sz="0"/>
-              <w:bottom w:val="single" w:color="CBD5E1" w:sz="4"/>
-              <w:right w:val="none" w:color="FFFFFF" w:sz="0"/>
-            </w:tcBorders>
-            <w:shd w:fill="F7F9FC" w:color="auto" w:val="clear"/>
-            <w:tcMar>
-              <w:top w:type="dxa" w:w="50"/>
-              <w:left w:type="dxa" w:w="110"/>
-              <w:bottom w:type="dxa" w:w="50"/>
-              <w:right w:type="dxa" w:w="110"/>
-            </w:tcMar>
-            <w:vAlign w:val="top"/>
-          </w:tcPr>
-          <w:p>
-            <w:pPr>
-              <w:spacing w:after="0" w:before="0" w:line="252"/>
-            </w:pPr>
-            <w:r>
-              <w:rPr>
-                <w:rFonts w:ascii="Arial" w:cs="Arial" w:eastAsia="Arial" w:hAnsi="Arial"/>
-                <w:b/>
-                <w:bCs/>
-                <w:color w:val="1F3A5F"/>
-                <w:sz w:val="17"/>
-                <w:szCs w:val="17"/>
-              </w:rPr>
-              <w:t xml:space="preserve">Steel and fertiliser targets not yet notified</w:t>
-            </w:r>
-          </w:p>
-        </w:tc>
-        <w:tc>
-          <w:tcPr>
-            <w:tcW w:type="dxa" w:w="6718"/>
-            <w:tcBorders>
-              <w:top w:val="none" w:color="FFFFFF" w:sz="0"/>
-              <w:left w:val="none" w:color="FFFFFF" w:sz="0"/>
-              <w:bottom w:val="single" w:color="CBD5E1" w:sz="4"/>
-              <w:right w:val="none" w:color="FFFFFF" w:sz="0"/>
-            </w:tcBorders>
-            <w:shd w:fill="F7F9FC" w:color="auto" w:val="clear"/>
-            <w:tcMar>
-              <w:top w:type="dxa" w:w="50"/>
-              <w:left w:type="dxa" w:w="110"/>
-              <w:bottom w:type="dxa" w:w="50"/>
-              <w:right w:type="dxa" w:w="110"/>
-            </w:tcMar>
-            <w:vAlign w:val="top"/>
-          </w:tcPr>
-          <w:p>
-            <w:pPr>
-              <w:spacing w:after="0" w:before="0" w:line="252"/>
-            </w:pPr>
-            <w:r>
-              <w:rPr>
-                <w:rFonts w:ascii="Arial" w:cs="Arial" w:eastAsia="Arial" w:hAnsi="Arial"/>
-                <w:color w:val="1F2937"/>
-                <w:sz w:val="17"/>
-                <w:szCs w:val="17"/>
-              </w:rPr>
-              <w:t xml:space="preserve">Configurable methodology library; build to the draft norms now.</w:t>
-            </w:r>
-          </w:p>
-        </w:tc>
-      </w:tr>
-      <w:tr>
-        <w:trPr>
-          <w:cantSplit/>
-        </w:trPr>
-        <w:tc>
-          <w:tcPr>
-            <w:tcW w:type="dxa" w:w="3600"/>
-            <w:tcBorders>
-              <w:top w:val="none" w:color="FFFFFF" w:sz="0"/>
-              <w:left w:val="none" w:color="FFFFFF" w:sz="0"/>
-              <w:bottom w:val="single" w:color="CBD5E1" w:sz="4"/>
-              <w:right w:val="none" w:color="FFFFFF" w:sz="0"/>
-            </w:tcBorders>
-            <w:shd w:fill="FFFFFF" w:color="auto" w:val="clear"/>
-            <w:tcMar>
-              <w:top w:type="dxa" w:w="50"/>
-              <w:left w:type="dxa" w:w="110"/>
-              <w:bottom w:type="dxa" w:w="50"/>
-              <w:right w:type="dxa" w:w="110"/>
-            </w:tcMar>
-            <w:vAlign w:val="top"/>
-          </w:tcPr>
-          <w:p>
-            <w:pPr>
-              <w:spacing w:after="0" w:before="0" w:line="252"/>
-            </w:pPr>
-            <w:r>
-              <w:rPr>
-                <w:rFonts w:ascii="Arial" w:cs="Arial" w:eastAsia="Arial" w:hAnsi="Arial"/>
-                <w:b/>
-                <w:bCs/>
-                <w:color w:val="1F3A5F"/>
-                <w:sz w:val="17"/>
-                <w:szCs w:val="17"/>
-              </w:rPr>
-              <w:t xml:space="preserve">Units hesitant to share emission data</w:t>
-            </w:r>
-          </w:p>
-        </w:tc>
-        <w:tc>
-          <w:tcPr>
-            <w:tcW w:type="dxa" w:w="6718"/>
-            <w:tcBorders>
-              <w:top w:val="none" w:color="FFFFFF" w:sz="0"/>
-              <w:left w:val="none" w:color="FFFFFF" w:sz="0"/>
-              <w:bottom w:val="single" w:color="CBD5E1" w:sz="4"/>
-              <w:right w:val="none" w:color="FFFFFF" w:sz="0"/>
-            </w:tcBorders>
-            <w:shd w:fill="FFFFFF" w:color="auto" w:val="clear"/>
-            <w:tcMar>
-              <w:top w:type="dxa" w:w="50"/>
-              <w:left w:type="dxa" w:w="110"/>
-              <w:bottom w:type="dxa" w:w="50"/>
-              <w:right w:type="dxa" w:w="110"/>
-            </w:tcMar>
-            <w:vAlign w:val="top"/>
-          </w:tcPr>
-          <w:p>
-            <w:pPr>
-              <w:spacing w:after="0" w:before="0" w:line="252"/>
-            </w:pPr>
-            <w:r>
-              <w:rPr>
-                <w:rFonts w:ascii="Arial" w:cs="Arial" w:eastAsia="Arial" w:hAnsi="Arial"/>
-                <w:color w:val="1F2937"/>
-                <w:sz w:val="17"/>
-                <w:szCs w:val="17"/>
-              </w:rPr>
-              <w:t xml:space="preserve">Voluntary and confidential, and it gives value first (CBAM reports buyers demand).</w:t>
-            </w:r>
-          </w:p>
-        </w:tc>
-      </w:tr>
-      <w:tr>
-        <w:trPr>
-          <w:cantSplit/>
-        </w:trPr>
-        <w:tc>
-          <w:tcPr>
-            <w:tcW w:type="dxa" w:w="3600"/>
-            <w:tcBorders>
-              <w:top w:val="none" w:color="FFFFFF" w:sz="0"/>
-              <w:left w:val="none" w:color="FFFFFF" w:sz="0"/>
-              <w:bottom w:val="single" w:color="CBD5E1" w:sz="4"/>
-              <w:right w:val="none" w:color="FFFFFF" w:sz="0"/>
-            </w:tcBorders>
-            <w:shd w:fill="F7F9FC" w:color="auto" w:val="clear"/>
-            <w:tcMar>
-              <w:top w:type="dxa" w:w="50"/>
-              <w:left w:type="dxa" w:w="110"/>
-              <w:bottom w:type="dxa" w:w="50"/>
-              <w:right w:type="dxa" w:w="110"/>
-            </w:tcMar>
-            <w:vAlign w:val="top"/>
-          </w:tcPr>
-          <w:p>
-            <w:pPr>
-              <w:spacing w:after="0" w:before="0" w:line="252"/>
-            </w:pPr>
-            <w:r>
-              <w:rPr>
-                <w:rFonts w:ascii="Arial" w:cs="Arial" w:eastAsia="Arial" w:hAnsi="Arial"/>
-                <w:b/>
-                <w:bCs/>
-                <w:color w:val="1F3A5F"/>
-                <w:sz w:val="17"/>
-                <w:szCs w:val="17"/>
-              </w:rPr>
-              <w:t xml:space="preserve">BEE or EU methodology changes</w:t>
-            </w:r>
-          </w:p>
-        </w:tc>
-        <w:tc>
-          <w:tcPr>
-            <w:tcW w:type="dxa" w:w="6718"/>
-            <w:tcBorders>
-              <w:top w:val="none" w:color="FFFFFF" w:sz="0"/>
-              <w:left w:val="none" w:color="FFFFFF" w:sz="0"/>
-              <w:bottom w:val="single" w:color="CBD5E1" w:sz="4"/>
-              <w:right w:val="none" w:color="FFFFFF" w:sz="0"/>
-            </w:tcBorders>
-            <w:shd w:fill="F7F9FC" w:color="auto" w:val="clear"/>
-            <w:tcMar>
-              <w:top w:type="dxa" w:w="50"/>
-              <w:left w:type="dxa" w:w="110"/>
-              <w:bottom w:type="dxa" w:w="50"/>
-              <w:right w:type="dxa" w:w="110"/>
-            </w:tcMar>
-            <w:vAlign w:val="top"/>
-          </w:tcPr>
-          <w:p>
-            <w:pPr>
-              <w:spacing w:after="0" w:before="0" w:line="252"/>
-            </w:pPr>
-            <w:r>
-              <w:rPr>
-                <w:rFonts w:ascii="Arial" w:cs="Arial" w:eastAsia="Arial" w:hAnsi="Arial"/>
-                <w:color w:val="1F2937"/>
-                <w:sz w:val="17"/>
-                <w:szCs w:val="17"/>
-              </w:rPr>
-              <w:t xml:space="preserve">Versioned calculations with full lineage; re-run history on demand.</w:t>
-            </w:r>
-          </w:p>
-        </w:tc>
-      </w:tr>
-    </w:tbl>
-    <w:p>
-      <w:r>
-        <w:br w:type="page"/>
-      </w:r>
-    </w:p>
     <w:p>
       <w:pPr>
         <w:spacing w:after="120" w:before="0" w:line="252"/>
@@ -21357,62 +18164,6 @@
           <w:szCs w:val="14"/>
         </w:rPr>
         <w:t xml:space="preserve">https://www.business-standard.com/economy/news/epfo-states-real-time-pm-vbry-data-district-outreach-126082100793_1.html</w:t>
-      </w:r>
-    </w:p>
-    <w:p>
-      <w:pPr>
-        <w:pStyle w:val="ListParagraph"/>
-        <w:numPr>
-          <w:ilvl w:val="0"/>
-          <w:numId w:val="3"/>
-        </w:numPr>
-        <w:spacing w:after="20" w:line="220"/>
-      </w:pPr>
-      <w:r>
-        <w:rPr>
-          <w:rFonts w:ascii="Arial" w:cs="Arial" w:eastAsia="Arial" w:hAnsi="Arial"/>
-          <w:color w:val="1F2937"/>
-          <w:sz w:val="15"/>
-          <w:szCs w:val="15"/>
-        </w:rPr>
-        <w:t xml:space="preserve">CCTS compliance obligations enter into force for seven sectors (ICAP) — </w:t>
-      </w:r>
-      <w:r>
-        <w:rPr>
-          <w:rFonts w:ascii="Arial" w:cs="Arial" w:eastAsia="Arial" w:hAnsi="Arial"/>
-          <w:color w:val="0F766E"/>
-          <w:sz w:val="14"/>
-          <w:szCs w:val="14"/>
-        </w:rPr>
-        <w:t xml:space="preserve">https://icapcarbonaction.com/en/news/compliance-obligations-under-indias-carbon-credit-trading-scheme-enter-force-seven-sectors</w:t>
-      </w:r>
-    </w:p>
-    <w:p>
-      <w:pPr>
-        <w:pStyle w:val="ListParagraph"/>
-        <w:numPr>
-          <w:ilvl w:val="0"/>
-          <w:numId w:val="3"/>
-        </w:numPr>
-        <w:spacing w:after="20" w:line="220"/>
-      </w:pPr>
-      <w:r>
-        <w:rPr>
-          <w:rFonts w:ascii="Arial" w:cs="Arial" w:eastAsia="Arial" w:hAnsi="Arial"/>
-          <w:color w:val="1F2937"/>
-          <w:sz w:val="15"/>
-          <w:szCs w:val="15"/>
-        </w:rPr>
-        <w:t xml:space="preserve">OCEMS status and CPCB online monitoring (PIB) — </w:t>
-      </w:r>
-      <w:r>
-        <w:rPr>
-          <w:rFonts w:ascii="Arial" w:cs="Arial" w:eastAsia="Arial" w:hAnsi="Arial"/>
-          <w:color w:val="0F766E"/>
-          <w:sz w:val="14"/>
-          <w:szCs w:val="14"/>
-        </w:rPr>
-        <w:t xml:space="preserve">https://www.pib.gov.in/PressReleasePage.aspx?PRID=2225207&amp;reg=48&amp;lang=2</w:t>
       </w:r>
     </w:p>
     <w:p>

</xml_diff>

<commit_message>
docs: brand proposal and slides as Kirnova Technologies
Replace the [Company Name] placeholder with Kirnova Technologies across
the booklet (cover, footer, metadata) and slides, and add the name's
meaning (kiran + nova: a new ray of light) to the vision slide.

Co-Authored-By: Claude Opus 5.5 <noreply@anthropic.com>
Claude-Session: https://claude.ai/code/session_01KWMWvQ91DXYjjkruj1UFSM
</commit_message>
<xml_diff>
--- a/docs/wb-ice-proposal-2026/WB_ICE_Initiatives.docx
+++ b/docs/wb-ice-proposal-2026/WB_ICE_Initiatives.docx
@@ -133,7 +133,7 @@
                 <w:sz w:val="21"/>
                 <w:szCs w:val="21"/>
               </w:rPr>
-              <w:t xml:space="preserve">[Company Name]</w:t>
+              <w:t xml:space="preserve">Kirnova Technologies</w:t>
             </w:r>
             <w:r>
               <w:rPr>
@@ -18275,7 +18275,7 @@
         <w:sz w:val="14"/>
         <w:szCs w:val="14"/>
       </w:rPr>
-      <w:t xml:space="preserve">[Company Name]  ·  Proposal to the ICE Department, Government of West Bengal  ·  Page </w:t>
+      <w:t xml:space="preserve">Kirnova Technologies  ·  Proposal to the ICE Department, Government of West Bengal  ·  Page </w:t>
     </w:r>
     <w:r>
       <w:rPr>

</xml_diff>